<commit_message>
wazuh agents installed in new system
</commit_message>
<xml_diff>
--- a/Documentation/cowrie setup.docx
+++ b/Documentation/cowrie setup.docx
@@ -24,164 +24,227 @@
           <w:b/>
           <w:bCs/>
         </w:rPr>
-        <w:t>Cowrie Honeypot Integration with Wazuh</w:t>
-      </w:r>
-    </w:p>
-    <w:p>
-      <w:pPr>
-        <w:pBdr>
-          <w:bottom w:val="single" w:sz="12" w:space="1" w:color="auto"/>
-        </w:pBdr>
+        <w:t xml:space="preserve">Cowrie Honeypot Integration with </w:t>
+      </w:r>
+      <w:proofErr w:type="spellStart"/>
+      <w:r>
         <w:rPr>
           <w:b/>
           <w:bCs/>
         </w:rPr>
-      </w:pPr>
-      <w:r>
+        <w:t>Wazuh</w:t>
+      </w:r>
+      <w:proofErr w:type="spellEnd"/>
+    </w:p>
+    <w:p>
+      <w:pPr>
+        <w:pBdr>
+          <w:bottom w:val="single" w:sz="12" w:space="1" w:color="auto"/>
+        </w:pBdr>
         <w:rPr>
           <w:b/>
           <w:bCs/>
         </w:rPr>
-        <w:t>Step 1: Install Docker</w:t>
-      </w:r>
-    </w:p>
-    <w:p>
-      <w:pPr>
-        <w:pBdr>
-          <w:bottom w:val="single" w:sz="12" w:space="1" w:color="auto"/>
-        </w:pBdr>
-      </w:pPr>
-      <w:r>
-        <w:t>Update the system:</w:t>
-      </w:r>
-    </w:p>
-    <w:p>
-      <w:pPr>
-        <w:pBdr>
-          <w:bottom w:val="single" w:sz="12" w:space="1" w:color="auto"/>
-        </w:pBdr>
-      </w:pPr>
-      <w:r>
-        <w:t>sudo apt update</w:t>
-      </w:r>
-    </w:p>
-    <w:p>
-      <w:pPr>
-        <w:pBdr>
-          <w:bottom w:val="single" w:sz="12" w:space="1" w:color="auto"/>
-        </w:pBdr>
-      </w:pPr>
-      <w:r>
-        <w:t>sudo apt upgrade -y</w:t>
-      </w:r>
-    </w:p>
-    <w:p>
-      <w:pPr>
-        <w:pBdr>
-          <w:bottom w:val="single" w:sz="12" w:space="1" w:color="auto"/>
-        </w:pBdr>
-      </w:pPr>
-      <w:r>
-        <w:t>Install Docker:</w:t>
-      </w:r>
-    </w:p>
-    <w:p>
-      <w:pPr>
-        <w:pBdr>
-          <w:bottom w:val="single" w:sz="12" w:space="1" w:color="auto"/>
-        </w:pBdr>
-      </w:pPr>
-      <w:r>
-        <w:t>sudo apt install docker.io -y</w:t>
-      </w:r>
-    </w:p>
-    <w:p>
-      <w:pPr>
-        <w:pBdr>
-          <w:bottom w:val="single" w:sz="12" w:space="1" w:color="auto"/>
-        </w:pBdr>
-      </w:pPr>
-      <w:r>
-        <w:t>Enable and start Docker:</w:t>
-      </w:r>
-    </w:p>
-    <w:p>
-      <w:pPr>
-        <w:pBdr>
-          <w:bottom w:val="single" w:sz="12" w:space="1" w:color="auto"/>
-        </w:pBdr>
-      </w:pPr>
-      <w:r>
-        <w:t>sudo systemctl enable docker</w:t>
-      </w:r>
-    </w:p>
-    <w:p>
-      <w:pPr>
-        <w:pBdr>
-          <w:bottom w:val="single" w:sz="12" w:space="1" w:color="auto"/>
-        </w:pBdr>
-      </w:pPr>
-      <w:r>
-        <w:t>sudo systemctl start docker</w:t>
-      </w:r>
-    </w:p>
-    <w:p>
-      <w:pPr>
-        <w:pBdr>
-          <w:bottom w:val="single" w:sz="12" w:space="1" w:color="auto"/>
-        </w:pBdr>
-      </w:pPr>
-      <w:r>
-        <w:t>Verify installation:</w:t>
-      </w:r>
-    </w:p>
-    <w:p>
-      <w:pPr>
-        <w:pBdr>
-          <w:bottom w:val="single" w:sz="12" w:space="1" w:color="auto"/>
-        </w:pBdr>
-      </w:pPr>
-      <w:r>
-        <w:t>docker --version</w:t>
-      </w:r>
-    </w:p>
-    <w:p>
-      <w:pPr>
-        <w:pBdr>
-          <w:bottom w:val="single" w:sz="12" w:space="1" w:color="auto"/>
-        </w:pBdr>
-      </w:pPr>
-      <w:r>
-        <w:t>sudo systemctl status docker</w:t>
-      </w:r>
-    </w:p>
-    <w:p>
-      <w:pPr>
-        <w:pBdr>
-          <w:bottom w:val="single" w:sz="12" w:space="1" w:color="auto"/>
-        </w:pBdr>
-      </w:pPr>
-      <w:r>
-        <w:pict w14:anchorId="0CF4DB4D">
-          <v:rect id="_x0000_i1085" style="width:0;height:1.5pt" o:hralign="center" o:hrstd="t" o:hr="t" fillcolor="#a0a0a0" stroked="f"/>
-        </w:pict>
-      </w:r>
-    </w:p>
-    <w:p>
-      <w:pPr>
-        <w:pBdr>
-          <w:bottom w:val="single" w:sz="12" w:space="1" w:color="auto"/>
-        </w:pBdr>
+      </w:pPr>
+      <w:r>
         <w:rPr>
           <w:b/>
           <w:bCs/>
         </w:rPr>
-      </w:pPr>
-      <w:r>
+        <w:t>Step 1: Install Docker</w:t>
+      </w:r>
+    </w:p>
+    <w:p>
+      <w:pPr>
+        <w:pBdr>
+          <w:bottom w:val="single" w:sz="12" w:space="1" w:color="auto"/>
+        </w:pBdr>
+      </w:pPr>
+      <w:r>
+        <w:t>Update the system:</w:t>
+      </w:r>
+    </w:p>
+    <w:p>
+      <w:pPr>
+        <w:pBdr>
+          <w:bottom w:val="single" w:sz="12" w:space="1" w:color="auto"/>
+        </w:pBdr>
+      </w:pPr>
+      <w:proofErr w:type="spellStart"/>
+      <w:r>
+        <w:t>sudo</w:t>
+      </w:r>
+      <w:proofErr w:type="spellEnd"/>
+      <w:r>
+        <w:t xml:space="preserve"> apt update</w:t>
+      </w:r>
+    </w:p>
+    <w:p>
+      <w:pPr>
+        <w:pBdr>
+          <w:bottom w:val="single" w:sz="12" w:space="1" w:color="auto"/>
+        </w:pBdr>
+      </w:pPr>
+      <w:proofErr w:type="spellStart"/>
+      <w:r>
+        <w:t>sudo</w:t>
+      </w:r>
+      <w:proofErr w:type="spellEnd"/>
+      <w:r>
+        <w:t xml:space="preserve"> apt upgrade -y</w:t>
+      </w:r>
+    </w:p>
+    <w:p>
+      <w:pPr>
+        <w:pBdr>
+          <w:bottom w:val="single" w:sz="12" w:space="1" w:color="auto"/>
+        </w:pBdr>
+      </w:pPr>
+      <w:r>
+        <w:t>Install Docker:</w:t>
+      </w:r>
+    </w:p>
+    <w:p>
+      <w:pPr>
+        <w:pBdr>
+          <w:bottom w:val="single" w:sz="12" w:space="1" w:color="auto"/>
+        </w:pBdr>
+      </w:pPr>
+      <w:proofErr w:type="spellStart"/>
+      <w:r>
+        <w:t>sudo</w:t>
+      </w:r>
+      <w:proofErr w:type="spellEnd"/>
+      <w:r>
+        <w:t xml:space="preserve"> apt install docker.io -y</w:t>
+      </w:r>
+    </w:p>
+    <w:p>
+      <w:pPr>
+        <w:pBdr>
+          <w:bottom w:val="single" w:sz="12" w:space="1" w:color="auto"/>
+        </w:pBdr>
+      </w:pPr>
+      <w:r>
+        <w:t>Enable and start Docker:</w:t>
+      </w:r>
+    </w:p>
+    <w:p>
+      <w:pPr>
+        <w:pBdr>
+          <w:bottom w:val="single" w:sz="12" w:space="1" w:color="auto"/>
+        </w:pBdr>
+      </w:pPr>
+      <w:proofErr w:type="spellStart"/>
+      <w:r>
+        <w:t>sudo</w:t>
+      </w:r>
+      <w:proofErr w:type="spellEnd"/>
+      <w:r>
+        <w:t xml:space="preserve"> </w:t>
+      </w:r>
+      <w:proofErr w:type="spellStart"/>
+      <w:r>
+        <w:t>systemctl</w:t>
+      </w:r>
+      <w:proofErr w:type="spellEnd"/>
+      <w:r>
+        <w:t xml:space="preserve"> enable docker</w:t>
+      </w:r>
+    </w:p>
+    <w:p>
+      <w:pPr>
+        <w:pBdr>
+          <w:bottom w:val="single" w:sz="12" w:space="1" w:color="auto"/>
+        </w:pBdr>
+      </w:pPr>
+      <w:proofErr w:type="spellStart"/>
+      <w:r>
+        <w:t>sudo</w:t>
+      </w:r>
+      <w:proofErr w:type="spellEnd"/>
+      <w:r>
+        <w:t xml:space="preserve"> </w:t>
+      </w:r>
+      <w:proofErr w:type="spellStart"/>
+      <w:r>
+        <w:t>systemctl</w:t>
+      </w:r>
+      <w:proofErr w:type="spellEnd"/>
+      <w:r>
+        <w:t xml:space="preserve"> start docker</w:t>
+      </w:r>
+    </w:p>
+    <w:p>
+      <w:pPr>
+        <w:pBdr>
+          <w:bottom w:val="single" w:sz="12" w:space="1" w:color="auto"/>
+        </w:pBdr>
+      </w:pPr>
+      <w:r>
+        <w:t>Verify installation:</w:t>
+      </w:r>
+    </w:p>
+    <w:p>
+      <w:pPr>
+        <w:pBdr>
+          <w:bottom w:val="single" w:sz="12" w:space="1" w:color="auto"/>
+        </w:pBdr>
+      </w:pPr>
+      <w:r>
+        <w:t>docker --version</w:t>
+      </w:r>
+    </w:p>
+    <w:p>
+      <w:pPr>
+        <w:pBdr>
+          <w:bottom w:val="single" w:sz="12" w:space="1" w:color="auto"/>
+        </w:pBdr>
+      </w:pPr>
+      <w:proofErr w:type="spellStart"/>
+      <w:r>
+        <w:t>sudo</w:t>
+      </w:r>
+      <w:proofErr w:type="spellEnd"/>
+      <w:r>
+        <w:t xml:space="preserve"> </w:t>
+      </w:r>
+      <w:proofErr w:type="spellStart"/>
+      <w:r>
+        <w:t>systemctl</w:t>
+      </w:r>
+      <w:proofErr w:type="spellEnd"/>
+      <w:r>
+        <w:t xml:space="preserve"> status docker</w:t>
+      </w:r>
+    </w:p>
+    <w:p>
+      <w:pPr>
+        <w:pBdr>
+          <w:bottom w:val="single" w:sz="12" w:space="1" w:color="auto"/>
+        </w:pBdr>
+      </w:pPr>
+      <w:r>
+        <w:pict w14:anchorId="0CF4DB4D">
+          <v:rect id="_x0000_i1025" style="width:0;height:1.5pt" o:hralign="center" o:hrstd="t" o:hr="t" fillcolor="#a0a0a0" stroked="f"/>
+        </w:pict>
+      </w:r>
+    </w:p>
+    <w:p>
+      <w:pPr>
+        <w:pBdr>
+          <w:bottom w:val="single" w:sz="12" w:space="1" w:color="auto"/>
+        </w:pBdr>
         <w:rPr>
           <w:b/>
           <w:bCs/>
         </w:rPr>
+      </w:pPr>
+      <w:r>
+        <w:rPr>
+          <w:b/>
+          <w:bCs/>
+        </w:rPr>
         <w:t>Step 2: Deploy Cowrie using Docker Compose</w:t>
       </w:r>
     </w:p>
@@ -201,8 +264,13 @@
           <w:bottom w:val="single" w:sz="12" w:space="1" w:color="auto"/>
         </w:pBdr>
       </w:pPr>
-      <w:r>
-        <w:t>mkdir ~/cowrie</w:t>
+      <w:proofErr w:type="spellStart"/>
+      <w:r>
+        <w:t>mkdir</w:t>
+      </w:r>
+      <w:proofErr w:type="spellEnd"/>
+      <w:r>
+        <w:t xml:space="preserve"> ~/cowrie</w:t>
       </w:r>
     </w:p>
     <w:p>
@@ -232,8 +300,13 @@
         </w:pBdr>
       </w:pPr>
       <w:r>
-        <w:t>nano docker-compose.yml</w:t>
-      </w:r>
+        <w:t>nano docker-</w:t>
+      </w:r>
+      <w:proofErr w:type="spellStart"/>
+      <w:r>
+        <w:t>compose.yml</w:t>
+      </w:r>
+      <w:proofErr w:type="spellEnd"/>
     </w:p>
     <w:p>
       <w:pPr>
@@ -272,17 +345,32 @@
         </w:pBdr>
       </w:pPr>
       <w:r>
-        <w:t xml:space="preserve">    image: cowrie/cowrie:latest</w:t>
-      </w:r>
-    </w:p>
-    <w:p>
-      <w:pPr>
-        <w:pBdr>
-          <w:bottom w:val="single" w:sz="12" w:space="1" w:color="auto"/>
-        </w:pBdr>
-      </w:pPr>
-      <w:r>
-        <w:t xml:space="preserve">    container_name: cowrie</w:t>
+        <w:t xml:space="preserve">    image: cowrie/</w:t>
+      </w:r>
+      <w:proofErr w:type="spellStart"/>
+      <w:proofErr w:type="gramStart"/>
+      <w:r>
+        <w:t>cowrie:latest</w:t>
+      </w:r>
+      <w:proofErr w:type="spellEnd"/>
+      <w:proofErr w:type="gramEnd"/>
+    </w:p>
+    <w:p>
+      <w:pPr>
+        <w:pBdr>
+          <w:bottom w:val="single" w:sz="12" w:space="1" w:color="auto"/>
+        </w:pBdr>
+      </w:pPr>
+      <w:r>
+        <w:t xml:space="preserve">    </w:t>
+      </w:r>
+      <w:proofErr w:type="spellStart"/>
+      <w:r>
+        <w:t>container_name</w:t>
+      </w:r>
+      <w:proofErr w:type="spellEnd"/>
+      <w:r>
+        <w:t>: cowrie</w:t>
       </w:r>
     </w:p>
     <w:p>
@@ -349,8 +437,13 @@
           <w:bottom w:val="single" w:sz="12" w:space="1" w:color="auto"/>
         </w:pBdr>
       </w:pPr>
-      <w:r>
-        <w:t>sudo docker compose up -d</w:t>
+      <w:proofErr w:type="spellStart"/>
+      <w:r>
+        <w:t>sudo</w:t>
+      </w:r>
+      <w:proofErr w:type="spellEnd"/>
+      <w:r>
+        <w:t xml:space="preserve"> docker compose up -d</w:t>
       </w:r>
     </w:p>
     <w:p>
@@ -369,9 +462,19 @@
           <w:bottom w:val="single" w:sz="12" w:space="1" w:color="auto"/>
         </w:pBdr>
       </w:pPr>
-      <w:r>
-        <w:t>sudo docker ps</w:t>
-      </w:r>
+      <w:proofErr w:type="spellStart"/>
+      <w:r>
+        <w:t>sudo</w:t>
+      </w:r>
+      <w:proofErr w:type="spellEnd"/>
+      <w:r>
+        <w:t xml:space="preserve"> docker </w:t>
+      </w:r>
+      <w:proofErr w:type="spellStart"/>
+      <w:r>
+        <w:t>ps</w:t>
+      </w:r>
+      <w:proofErr w:type="spellEnd"/>
     </w:p>
     <w:p>
       <w:pPr>
@@ -389,8 +492,13 @@
           <w:bottom w:val="single" w:sz="12" w:space="1" w:color="auto"/>
         </w:pBdr>
       </w:pPr>
-      <w:r>
-        <w:t>sudo docker logs -f cowrie</w:t>
+      <w:proofErr w:type="spellStart"/>
+      <w:r>
+        <w:t>sudo</w:t>
+      </w:r>
+      <w:proofErr w:type="spellEnd"/>
+      <w:r>
+        <w:t xml:space="preserve"> docker logs -f cowrie</w:t>
       </w:r>
     </w:p>
     <w:p>
@@ -421,7 +529,7 @@
       </w:pPr>
       <w:r>
         <w:pict w14:anchorId="288DC508">
-          <v:rect id="_x0000_i1086" style="width:0;height:1.5pt" o:hralign="center" o:hrstd="t" o:hr="t" fillcolor="#a0a0a0" stroked="f"/>
+          <v:rect id="_x0000_i1026" style="width:0;height:1.5pt" o:hralign="center" o:hrstd="t" o:hr="t" fillcolor="#a0a0a0" stroked="f"/>
         </w:pict>
       </w:r>
     </w:p>
@@ -479,9 +587,11 @@
           <w:bottom w:val="single" w:sz="12" w:space="1" w:color="auto"/>
         </w:pBdr>
       </w:pPr>
+      <w:proofErr w:type="spellStart"/>
       <w:r>
         <w:t>toor</w:t>
       </w:r>
+      <w:proofErr w:type="spellEnd"/>
     </w:p>
     <w:p>
       <w:pPr>
@@ -499,9 +609,11 @@
           <w:bottom w:val="single" w:sz="12" w:space="1" w:color="auto"/>
         </w:pBdr>
       </w:pPr>
+      <w:proofErr w:type="spellStart"/>
       <w:r>
         <w:t>pwd</w:t>
       </w:r>
+      <w:proofErr w:type="spellEnd"/>
     </w:p>
     <w:p>
       <w:pPr>
@@ -519,9 +631,11 @@
           <w:bottom w:val="single" w:sz="12" w:space="1" w:color="auto"/>
         </w:pBdr>
       </w:pPr>
+      <w:proofErr w:type="spellStart"/>
       <w:r>
         <w:t>whoami</w:t>
       </w:r>
+      <w:proofErr w:type="spellEnd"/>
     </w:p>
     <w:p>
       <w:pPr>
@@ -539,18 +653,28 @@
           <w:bottom w:val="single" w:sz="12" w:space="1" w:color="auto"/>
         </w:pBdr>
       </w:pPr>
-      <w:r>
-        <w:t>uname -a</w:t>
-      </w:r>
-    </w:p>
-    <w:p>
-      <w:pPr>
-        <w:pBdr>
-          <w:bottom w:val="single" w:sz="12" w:space="1" w:color="auto"/>
-        </w:pBdr>
-      </w:pPr>
-      <w:r>
-        <w:t>wget http://example.com/file</w:t>
+      <w:proofErr w:type="spellStart"/>
+      <w:r>
+        <w:t>uname</w:t>
+      </w:r>
+      <w:proofErr w:type="spellEnd"/>
+      <w:r>
+        <w:t xml:space="preserve"> -a</w:t>
+      </w:r>
+    </w:p>
+    <w:p>
+      <w:pPr>
+        <w:pBdr>
+          <w:bottom w:val="single" w:sz="12" w:space="1" w:color="auto"/>
+        </w:pBdr>
+      </w:pPr>
+      <w:proofErr w:type="spellStart"/>
+      <w:r>
+        <w:t>wget</w:t>
+      </w:r>
+      <w:proofErr w:type="spellEnd"/>
+      <w:r>
+        <w:t xml:space="preserve"> http://example.com/file</w:t>
       </w:r>
     </w:p>
     <w:p>
@@ -591,7 +715,7 @@
       </w:pPr>
       <w:r>
         <w:pict w14:anchorId="61CC9640">
-          <v:rect id="_x0000_i1087" style="width:0;height:1.5pt" o:hralign="center" o:hrstd="t" o:hr="t" fillcolor="#a0a0a0" stroked="f"/>
+          <v:rect id="_x0000_i1027" style="width:0;height:1.5pt" o:hralign="center" o:hrstd="t" o:hr="t" fillcolor="#a0a0a0" stroked="f"/>
         </w:pict>
       </w:r>
     </w:p>
@@ -611,128 +735,103 @@
           <w:bCs/>
         </w:rPr>
         <w:lastRenderedPageBreak/>
-        <w:t>Step 4: Install Wazuh Agent on Cowrie VM</w:t>
-      </w:r>
-    </w:p>
-    <w:p>
-      <w:pPr>
-        <w:pBdr>
-          <w:bottom w:val="single" w:sz="12" w:space="1" w:color="auto"/>
-        </w:pBdr>
-      </w:pPr>
-      <w:r>
-        <w:t>Register the Cowrie VM from the Wazuh Dashboard.</w:t>
-      </w:r>
-    </w:p>
-    <w:p>
-      <w:pPr>
-        <w:pBdr>
-          <w:bottom w:val="single" w:sz="12" w:space="1" w:color="auto"/>
-        </w:pBdr>
-      </w:pPr>
-      <w:r>
-        <w:t>Install the agent.</w:t>
-      </w:r>
-    </w:p>
-    <w:p>
-      <w:pPr>
-        <w:pBdr>
-          <w:bottom w:val="single" w:sz="12" w:space="1" w:color="auto"/>
-        </w:pBdr>
-      </w:pPr>
-      <w:r>
-        <w:t>Verify:</w:t>
-      </w:r>
-    </w:p>
-    <w:p>
-      <w:pPr>
-        <w:pBdr>
-          <w:bottom w:val="single" w:sz="12" w:space="1" w:color="auto"/>
-        </w:pBdr>
-      </w:pPr>
-      <w:r>
-        <w:t>sudo systemctl status wazuh-agent</w:t>
-      </w:r>
-    </w:p>
-    <w:p>
-      <w:pPr>
-        <w:pBdr>
-          <w:bottom w:val="single" w:sz="12" w:space="1" w:color="auto"/>
-        </w:pBdr>
-      </w:pPr>
-      <w:r>
-        <w:pict w14:anchorId="00AD06FF">
-          <v:rect id="_x0000_i1088" style="width:0;height:1.5pt" o:hralign="center" o:hrstd="t" o:hr="t" fillcolor="#a0a0a0" stroked="f"/>
-        </w:pict>
-      </w:r>
-    </w:p>
-    <w:p>
-      <w:pPr>
-        <w:pBdr>
-          <w:bottom w:val="single" w:sz="12" w:space="1" w:color="auto"/>
-        </w:pBdr>
+        <w:t xml:space="preserve">Step 4: Install </w:t>
+      </w:r>
+      <w:proofErr w:type="spellStart"/>
+      <w:r>
         <w:rPr>
           <w:b/>
           <w:bCs/>
         </w:rPr>
-      </w:pPr>
+        <w:t>Wazuh</w:t>
+      </w:r>
+      <w:proofErr w:type="spellEnd"/>
       <w:r>
         <w:rPr>
           <w:b/>
           <w:bCs/>
         </w:rPr>
-        <w:t>Step 5: Locate Cowrie JSON Logs</w:t>
-      </w:r>
-    </w:p>
-    <w:p>
-      <w:pPr>
-        <w:pBdr>
-          <w:bottom w:val="single" w:sz="12" w:space="1" w:color="auto"/>
-        </w:pBdr>
-      </w:pPr>
-      <w:r>
-        <w:t>Identify the Docker volume:</w:t>
-      </w:r>
-    </w:p>
-    <w:p>
-      <w:pPr>
-        <w:pBdr>
-          <w:bottom w:val="single" w:sz="12" w:space="1" w:color="auto"/>
-        </w:pBdr>
-      </w:pPr>
-      <w:r>
-        <w:t>sudo docker inspect cowrie</w:t>
-      </w:r>
-    </w:p>
-    <w:p>
-      <w:pPr>
-        <w:pBdr>
-          <w:bottom w:val="single" w:sz="12" w:space="1" w:color="auto"/>
-        </w:pBdr>
-      </w:pPr>
-      <w:r>
-        <w:t>Locate:</w:t>
-      </w:r>
-    </w:p>
-    <w:p>
-      <w:pPr>
-        <w:pBdr>
-          <w:bottom w:val="single" w:sz="12" w:space="1" w:color="auto"/>
-        </w:pBdr>
-      </w:pPr>
-      <w:r>
-        <w:t>/var/lib/docker/volumes/&lt;volume-id&gt;/_data/log/cowrie/cowrie.json</w:t>
-      </w:r>
-    </w:p>
-    <w:p>
-      <w:pPr>
-        <w:pBdr>
-          <w:bottom w:val="single" w:sz="12" w:space="1" w:color="auto"/>
-        </w:pBdr>
-      </w:pPr>
-      <w:r>
-        <w:pict w14:anchorId="08F20DC7">
-          <v:rect id="_x0000_i1089" style="width:0;height:1.5pt" o:hralign="center" o:hrstd="t" o:hr="t" fillcolor="#a0a0a0" stroked="f"/>
+        <w:t xml:space="preserve"> Agent on Cowrie VM</w:t>
+      </w:r>
+    </w:p>
+    <w:p>
+      <w:pPr>
+        <w:pBdr>
+          <w:bottom w:val="single" w:sz="12" w:space="1" w:color="auto"/>
+        </w:pBdr>
+      </w:pPr>
+      <w:r>
+        <w:t xml:space="preserve">Register the Cowrie VM from the </w:t>
+      </w:r>
+      <w:proofErr w:type="spellStart"/>
+      <w:r>
+        <w:t>Wazuh</w:t>
+      </w:r>
+      <w:proofErr w:type="spellEnd"/>
+      <w:r>
+        <w:t xml:space="preserve"> Dashboard.</w:t>
+      </w:r>
+    </w:p>
+    <w:p>
+      <w:pPr>
+        <w:pBdr>
+          <w:bottom w:val="single" w:sz="12" w:space="1" w:color="auto"/>
+        </w:pBdr>
+      </w:pPr>
+      <w:r>
+        <w:t>Install the agent.</w:t>
+      </w:r>
+    </w:p>
+    <w:p>
+      <w:pPr>
+        <w:pBdr>
+          <w:bottom w:val="single" w:sz="12" w:space="1" w:color="auto"/>
+        </w:pBdr>
+      </w:pPr>
+      <w:r>
+        <w:t>Verify:</w:t>
+      </w:r>
+    </w:p>
+    <w:p>
+      <w:pPr>
+        <w:pBdr>
+          <w:bottom w:val="single" w:sz="12" w:space="1" w:color="auto"/>
+        </w:pBdr>
+      </w:pPr>
+      <w:proofErr w:type="spellStart"/>
+      <w:r>
+        <w:t>sudo</w:t>
+      </w:r>
+      <w:proofErr w:type="spellEnd"/>
+      <w:r>
+        <w:t xml:space="preserve"> </w:t>
+      </w:r>
+      <w:proofErr w:type="spellStart"/>
+      <w:r>
+        <w:t>systemctl</w:t>
+      </w:r>
+      <w:proofErr w:type="spellEnd"/>
+      <w:r>
+        <w:t xml:space="preserve"> status </w:t>
+      </w:r>
+      <w:proofErr w:type="spellStart"/>
+      <w:r>
+        <w:t>wazuh</w:t>
+      </w:r>
+      <w:proofErr w:type="spellEnd"/>
+      <w:r>
+        <w:t>-agent</w:t>
+      </w:r>
+    </w:p>
+    <w:p>
+      <w:pPr>
+        <w:pBdr>
+          <w:bottom w:val="single" w:sz="12" w:space="1" w:color="auto"/>
+        </w:pBdr>
+      </w:pPr>
+      <w:r>
+        <w:pict w14:anchorId="00AD06FF">
+          <v:rect id="_x0000_i1028" style="width:0;height:1.5pt" o:hralign="center" o:hrstd="t" o:hr="t" fillcolor="#a0a0a0" stroked="f"/>
         </w:pict>
       </w:r>
     </w:p>
@@ -751,7 +850,103 @@
           <w:b/>
           <w:bCs/>
         </w:rPr>
-        <w:t>Step 6: Configure Wazuh Agent to Monitor Cowrie Logs</w:t>
+        <w:t>Step 5: Locate Cowrie JSON Logs</w:t>
+      </w:r>
+    </w:p>
+    <w:p>
+      <w:pPr>
+        <w:pBdr>
+          <w:bottom w:val="single" w:sz="12" w:space="1" w:color="auto"/>
+        </w:pBdr>
+      </w:pPr>
+      <w:r>
+        <w:t>Identify the Docker volume:</w:t>
+      </w:r>
+    </w:p>
+    <w:p>
+      <w:pPr>
+        <w:pBdr>
+          <w:bottom w:val="single" w:sz="12" w:space="1" w:color="auto"/>
+        </w:pBdr>
+      </w:pPr>
+      <w:proofErr w:type="spellStart"/>
+      <w:r>
+        <w:t>sudo</w:t>
+      </w:r>
+      <w:proofErr w:type="spellEnd"/>
+      <w:r>
+        <w:t xml:space="preserve"> docker inspect cowrie</w:t>
+      </w:r>
+    </w:p>
+    <w:p>
+      <w:pPr>
+        <w:pBdr>
+          <w:bottom w:val="single" w:sz="12" w:space="1" w:color="auto"/>
+        </w:pBdr>
+      </w:pPr>
+      <w:r>
+        <w:t>Locate:</w:t>
+      </w:r>
+    </w:p>
+    <w:p>
+      <w:pPr>
+        <w:pBdr>
+          <w:bottom w:val="single" w:sz="12" w:space="1" w:color="auto"/>
+        </w:pBdr>
+      </w:pPr>
+      <w:r>
+        <w:t>/var/lib/docker/volumes/&lt;volume-id&gt;/_data/log/cowrie/</w:t>
+      </w:r>
+      <w:proofErr w:type="spellStart"/>
+      <w:r>
+        <w:t>cowrie.json</w:t>
+      </w:r>
+      <w:proofErr w:type="spellEnd"/>
+    </w:p>
+    <w:p>
+      <w:pPr>
+        <w:pBdr>
+          <w:bottom w:val="single" w:sz="12" w:space="1" w:color="auto"/>
+        </w:pBdr>
+      </w:pPr>
+      <w:r>
+        <w:pict w14:anchorId="08F20DC7">
+          <v:rect id="_x0000_i1029" style="width:0;height:1.5pt" o:hralign="center" o:hrstd="t" o:hr="t" fillcolor="#a0a0a0" stroked="f"/>
+        </w:pict>
+      </w:r>
+    </w:p>
+    <w:p>
+      <w:pPr>
+        <w:pBdr>
+          <w:bottom w:val="single" w:sz="12" w:space="1" w:color="auto"/>
+        </w:pBdr>
+        <w:rPr>
+          <w:b/>
+          <w:bCs/>
+        </w:rPr>
+      </w:pPr>
+      <w:r>
+        <w:rPr>
+          <w:b/>
+          <w:bCs/>
+        </w:rPr>
+        <w:t xml:space="preserve">Step 6: Configure </w:t>
+      </w:r>
+      <w:proofErr w:type="spellStart"/>
+      <w:r>
+        <w:rPr>
+          <w:b/>
+          <w:bCs/>
+        </w:rPr>
+        <w:t>Wazuh</w:t>
+      </w:r>
+      <w:proofErr w:type="spellEnd"/>
+      <w:r>
+        <w:rPr>
+          <w:b/>
+          <w:bCs/>
+        </w:rPr>
+        <w:t xml:space="preserve"> Agent to Monitor Cowrie Logs</w:t>
       </w:r>
     </w:p>
     <w:p>
@@ -770,9 +965,27 @@
           <w:bottom w:val="single" w:sz="12" w:space="1" w:color="auto"/>
         </w:pBdr>
       </w:pPr>
-      <w:r>
-        <w:t>sudo nano /var/ossec/etc/ossec.conf</w:t>
-      </w:r>
+      <w:proofErr w:type="spellStart"/>
+      <w:r>
+        <w:t>sudo</w:t>
+      </w:r>
+      <w:proofErr w:type="spellEnd"/>
+      <w:r>
+        <w:t xml:space="preserve"> nano /var/</w:t>
+      </w:r>
+      <w:proofErr w:type="spellStart"/>
+      <w:r>
+        <w:t>ossec</w:t>
+      </w:r>
+      <w:proofErr w:type="spellEnd"/>
+      <w:r>
+        <w:t>/etc/</w:t>
+      </w:r>
+      <w:proofErr w:type="spellStart"/>
+      <w:r>
+        <w:t>ossec.conf</w:t>
+      </w:r>
+      <w:proofErr w:type="spellEnd"/>
     </w:p>
     <w:p>
       <w:pPr>
@@ -791,17 +1004,49 @@
         </w:pBdr>
       </w:pPr>
       <w:r>
-        <w:t>&lt;localfile&gt;</w:t>
-      </w:r>
-    </w:p>
-    <w:p>
-      <w:pPr>
-        <w:pBdr>
-          <w:bottom w:val="single" w:sz="12" w:space="1" w:color="auto"/>
-        </w:pBdr>
-      </w:pPr>
-      <w:r>
-        <w:t xml:space="preserve">    &lt;log_format&gt;json&lt;/log_format&gt;</w:t>
+        <w:t>&lt;</w:t>
+      </w:r>
+      <w:proofErr w:type="spellStart"/>
+      <w:r>
+        <w:t>localfile</w:t>
+      </w:r>
+      <w:proofErr w:type="spellEnd"/>
+      <w:r>
+        <w:t>&gt;</w:t>
+      </w:r>
+    </w:p>
+    <w:p>
+      <w:pPr>
+        <w:pBdr>
+          <w:bottom w:val="single" w:sz="12" w:space="1" w:color="auto"/>
+        </w:pBdr>
+      </w:pPr>
+      <w:r>
+        <w:t xml:space="preserve">    &lt;</w:t>
+      </w:r>
+      <w:proofErr w:type="spellStart"/>
+      <w:r>
+        <w:t>log_format</w:t>
+      </w:r>
+      <w:proofErr w:type="spellEnd"/>
+      <w:r>
+        <w:t>&gt;</w:t>
+      </w:r>
+      <w:proofErr w:type="spellStart"/>
+      <w:r>
+        <w:t>json</w:t>
+      </w:r>
+      <w:proofErr w:type="spellEnd"/>
+      <w:r>
+        <w:t>&lt;/</w:t>
+      </w:r>
+      <w:proofErr w:type="spellStart"/>
+      <w:r>
+        <w:t>log_format</w:t>
+      </w:r>
+      <w:proofErr w:type="spellEnd"/>
+      <w:r>
+        <w:t>&gt;</w:t>
       </w:r>
     </w:p>
     <w:p>
@@ -821,7 +1066,15 @@
         </w:pBdr>
       </w:pPr>
       <w:r>
-        <w:t>&lt;/localfile&gt;</w:t>
+        <w:t>&lt;/</w:t>
+      </w:r>
+      <w:proofErr w:type="spellStart"/>
+      <w:r>
+        <w:t>localfile</w:t>
+      </w:r>
+      <w:proofErr w:type="spellEnd"/>
+      <w:r>
+        <w:t>&gt;</w:t>
       </w:r>
     </w:p>
     <w:p>
@@ -840,8 +1093,29 @@
           <w:bottom w:val="single" w:sz="12" w:space="1" w:color="auto"/>
         </w:pBdr>
       </w:pPr>
-      <w:r>
-        <w:t>sudo systemctl restart wazuh-agent</w:t>
+      <w:proofErr w:type="spellStart"/>
+      <w:r>
+        <w:t>sudo</w:t>
+      </w:r>
+      <w:proofErr w:type="spellEnd"/>
+      <w:r>
+        <w:t xml:space="preserve"> </w:t>
+      </w:r>
+      <w:proofErr w:type="spellStart"/>
+      <w:r>
+        <w:t>systemctl</w:t>
+      </w:r>
+      <w:proofErr w:type="spellEnd"/>
+      <w:r>
+        <w:t xml:space="preserve"> restart </w:t>
+      </w:r>
+      <w:proofErr w:type="spellStart"/>
+      <w:r>
+        <w:t>wazuh</w:t>
+      </w:r>
+      <w:proofErr w:type="spellEnd"/>
+      <w:r>
+        <w:t>-agent</w:t>
       </w:r>
     </w:p>
     <w:p>
@@ -860,8 +1134,21 @@
           <w:bottom w:val="single" w:sz="12" w:space="1" w:color="auto"/>
         </w:pBdr>
       </w:pPr>
-      <w:r>
-        <w:t>sudo tail -f /var/ossec/logs/ossec.log</w:t>
+      <w:proofErr w:type="spellStart"/>
+      <w:r>
+        <w:t>sudo</w:t>
+      </w:r>
+      <w:proofErr w:type="spellEnd"/>
+      <w:r>
+        <w:t xml:space="preserve"> tail -f /var/</w:t>
+      </w:r>
+      <w:proofErr w:type="spellStart"/>
+      <w:r>
+        <w:t>ossec</w:t>
+      </w:r>
+      <w:proofErr w:type="spellEnd"/>
+      <w:r>
+        <w:t>/logs/ossec.log</w:t>
       </w:r>
     </w:p>
     <w:p>
@@ -880,19 +1167,29 @@
           <w:bottom w:val="single" w:sz="12" w:space="1" w:color="auto"/>
         </w:pBdr>
       </w:pPr>
-      <w:r>
-        <w:t>Analyzing file:</w:t>
-      </w:r>
-    </w:p>
-    <w:p>
-      <w:pPr>
-        <w:pBdr>
-          <w:bottom w:val="single" w:sz="12" w:space="1" w:color="auto"/>
-        </w:pBdr>
-      </w:pPr>
-      <w:r>
-        <w:t>.../cowrie.json</w:t>
-      </w:r>
+      <w:proofErr w:type="spellStart"/>
+      <w:r>
+        <w:t>Analyzing</w:t>
+      </w:r>
+      <w:proofErr w:type="spellEnd"/>
+      <w:r>
+        <w:t xml:space="preserve"> file:</w:t>
+      </w:r>
+    </w:p>
+    <w:p>
+      <w:pPr>
+        <w:pBdr>
+          <w:bottom w:val="single" w:sz="12" w:space="1" w:color="auto"/>
+        </w:pBdr>
+      </w:pPr>
+      <w:r>
+        <w:t>.../</w:t>
+      </w:r>
+      <w:proofErr w:type="spellStart"/>
+      <w:r>
+        <w:t>cowrie.json</w:t>
+      </w:r>
+      <w:proofErr w:type="spellEnd"/>
     </w:p>
     <w:p>
       <w:pPr>
@@ -903,7 +1200,7 @@
       <w:r>
         <w:lastRenderedPageBreak/>
         <w:pict w14:anchorId="4907340E">
-          <v:rect id="_x0000_i1090" style="width:0;height:1.5pt" o:hralign="center" o:hrstd="t" o:hr="t" fillcolor="#a0a0a0" stroked="f"/>
+          <v:rect id="_x0000_i1030" style="width:0;height:1.5pt" o:hralign="center" o:hrstd="t" o:hr="t" fillcolor="#a0a0a0" stroked="f"/>
         </w:pict>
       </w:r>
     </w:p>
@@ -922,28 +1219,70 @@
           <w:b/>
           <w:bCs/>
         </w:rPr>
-        <w:t>Step 7: Verify Events Reach the Wazuh Manager</w:t>
-      </w:r>
-    </w:p>
-    <w:p>
-      <w:pPr>
-        <w:pBdr>
-          <w:bottom w:val="single" w:sz="12" w:space="1" w:color="auto"/>
-        </w:pBdr>
-      </w:pPr>
-      <w:r>
-        <w:t>On the Wazuh server:</w:t>
-      </w:r>
-    </w:p>
-    <w:p>
-      <w:pPr>
-        <w:pBdr>
-          <w:bottom w:val="single" w:sz="12" w:space="1" w:color="auto"/>
-        </w:pBdr>
-      </w:pPr>
-      <w:r>
-        <w:t>sudo tail -f /var/ossec/logs/archives/archives.json</w:t>
-      </w:r>
+        <w:t xml:space="preserve">Step 7: Verify Events Reach the </w:t>
+      </w:r>
+      <w:proofErr w:type="spellStart"/>
+      <w:r>
+        <w:rPr>
+          <w:b/>
+          <w:bCs/>
+        </w:rPr>
+        <w:t>Wazuh</w:t>
+      </w:r>
+      <w:proofErr w:type="spellEnd"/>
+      <w:r>
+        <w:rPr>
+          <w:b/>
+          <w:bCs/>
+        </w:rPr>
+        <w:t xml:space="preserve"> Manager</w:t>
+      </w:r>
+    </w:p>
+    <w:p>
+      <w:pPr>
+        <w:pBdr>
+          <w:bottom w:val="single" w:sz="12" w:space="1" w:color="auto"/>
+        </w:pBdr>
+      </w:pPr>
+      <w:r>
+        <w:t xml:space="preserve">On the </w:t>
+      </w:r>
+      <w:proofErr w:type="spellStart"/>
+      <w:r>
+        <w:t>Wazuh</w:t>
+      </w:r>
+      <w:proofErr w:type="spellEnd"/>
+      <w:r>
+        <w:t xml:space="preserve"> server:</w:t>
+      </w:r>
+    </w:p>
+    <w:p>
+      <w:pPr>
+        <w:pBdr>
+          <w:bottom w:val="single" w:sz="12" w:space="1" w:color="auto"/>
+        </w:pBdr>
+      </w:pPr>
+      <w:proofErr w:type="spellStart"/>
+      <w:r>
+        <w:t>sudo</w:t>
+      </w:r>
+      <w:proofErr w:type="spellEnd"/>
+      <w:r>
+        <w:t xml:space="preserve"> tail -f /var/</w:t>
+      </w:r>
+      <w:proofErr w:type="spellStart"/>
+      <w:r>
+        <w:t>ossec</w:t>
+      </w:r>
+      <w:proofErr w:type="spellEnd"/>
+      <w:r>
+        <w:t>/logs/archives/</w:t>
+      </w:r>
+      <w:proofErr w:type="spellStart"/>
+      <w:r>
+        <w:t>archives.json</w:t>
+      </w:r>
+      <w:proofErr w:type="spellEnd"/>
     </w:p>
     <w:p>
       <w:pPr>
@@ -975,8 +1314,18 @@
           <w:bottom w:val="single" w:sz="12" w:space="1" w:color="auto"/>
         </w:pBdr>
       </w:pPr>
-      <w:r>
-        <w:t xml:space="preserve">cowrie.login.success </w:t>
+      <w:proofErr w:type="spellStart"/>
+      <w:r>
+        <w:t>cowrie.</w:t>
+      </w:r>
+      <w:proofErr w:type="gramStart"/>
+      <w:r>
+        <w:t>login.success</w:t>
+      </w:r>
+      <w:proofErr w:type="spellEnd"/>
+      <w:proofErr w:type="gramEnd"/>
+      <w:r>
+        <w:t xml:space="preserve"> </w:t>
       </w:r>
     </w:p>
     <w:p>
@@ -989,8 +1338,18 @@
           <w:bottom w:val="single" w:sz="12" w:space="1" w:color="auto"/>
         </w:pBdr>
       </w:pPr>
-      <w:r>
-        <w:t xml:space="preserve">cowrie.command.input </w:t>
+      <w:proofErr w:type="spellStart"/>
+      <w:proofErr w:type="gramStart"/>
+      <w:r>
+        <w:t>cowrie.command</w:t>
+      </w:r>
+      <w:proofErr w:type="gramEnd"/>
+      <w:r>
+        <w:t>.input</w:t>
+      </w:r>
+      <w:proofErr w:type="spellEnd"/>
+      <w:r>
+        <w:t xml:space="preserve"> </w:t>
       </w:r>
     </w:p>
     <w:p>
@@ -1003,8 +1362,18 @@
           <w:bottom w:val="single" w:sz="12" w:space="1" w:color="auto"/>
         </w:pBdr>
       </w:pPr>
-      <w:r>
-        <w:t xml:space="preserve">cowrie.client.version </w:t>
+      <w:proofErr w:type="spellStart"/>
+      <w:proofErr w:type="gramStart"/>
+      <w:r>
+        <w:t>cowrie.client</w:t>
+      </w:r>
+      <w:proofErr w:type="gramEnd"/>
+      <w:r>
+        <w:t>.version</w:t>
+      </w:r>
+      <w:proofErr w:type="spellEnd"/>
+      <w:r>
+        <w:t xml:space="preserve"> </w:t>
       </w:r>
     </w:p>
     <w:p>
@@ -1017,8 +1386,18 @@
           <w:bottom w:val="single" w:sz="12" w:space="1" w:color="auto"/>
         </w:pBdr>
       </w:pPr>
-      <w:r>
-        <w:t xml:space="preserve">cowrie.session.closed </w:t>
+      <w:proofErr w:type="spellStart"/>
+      <w:proofErr w:type="gramStart"/>
+      <w:r>
+        <w:t>cowrie.session</w:t>
+      </w:r>
+      <w:proofErr w:type="gramEnd"/>
+      <w:r>
+        <w:t>.closed</w:t>
+      </w:r>
+      <w:proofErr w:type="spellEnd"/>
+      <w:r>
+        <w:t xml:space="preserve"> </w:t>
       </w:r>
     </w:p>
     <w:p>
@@ -1109,9 +1488,13 @@
           <w:bottom w:val="single" w:sz="12" w:space="1" w:color="auto"/>
         </w:pBdr>
       </w:pPr>
+      <w:proofErr w:type="spellStart"/>
+      <w:proofErr w:type="gramStart"/>
       <w:r>
         <w:t>cowrie.json</w:t>
       </w:r>
+      <w:proofErr w:type="spellEnd"/>
+      <w:proofErr w:type="gramEnd"/>
     </w:p>
     <w:p>
       <w:pPr>
@@ -1145,8 +1528,13 @@
           <w:bottom w:val="single" w:sz="12" w:space="1" w:color="auto"/>
         </w:pBdr>
       </w:pPr>
-      <w:r>
-        <w:t>Wazuh Agent</w:t>
+      <w:proofErr w:type="spellStart"/>
+      <w:r>
+        <w:t>Wazuh</w:t>
+      </w:r>
+      <w:proofErr w:type="spellEnd"/>
+      <w:r>
+        <w:t xml:space="preserve"> Agent</w:t>
       </w:r>
     </w:p>
     <w:p>
@@ -1181,8 +1569,13 @@
           <w:bottom w:val="single" w:sz="12" w:space="1" w:color="auto"/>
         </w:pBdr>
       </w:pPr>
-      <w:r>
-        <w:t>Wazuh Manager</w:t>
+      <w:proofErr w:type="spellStart"/>
+      <w:r>
+        <w:t>Wazuh</w:t>
+      </w:r>
+      <w:proofErr w:type="spellEnd"/>
+      <w:r>
+        <w:t xml:space="preserve"> Manager</w:t>
       </w:r>
     </w:p>
     <w:p>
@@ -1217,9 +1610,13 @@
           <w:bottom w:val="single" w:sz="12" w:space="1" w:color="auto"/>
         </w:pBdr>
       </w:pPr>
+      <w:proofErr w:type="spellStart"/>
+      <w:proofErr w:type="gramStart"/>
       <w:r>
         <w:t>archives.json</w:t>
       </w:r>
+      <w:proofErr w:type="spellEnd"/>
+      <w:proofErr w:type="gramEnd"/>
     </w:p>
     <w:p>
       <w:pPr>
@@ -1229,7 +1626,7 @@
       </w:pPr>
       <w:r>
         <w:pict w14:anchorId="3464DB3C">
-          <v:rect id="_x0000_i1091" style="width:0;height:1.5pt" o:hralign="center" o:hrstd="t" o:hr="t" fillcolor="#a0a0a0" stroked="f"/>
+          <v:rect id="_x0000_i1031" style="width:0;height:1.5pt" o:hralign="center" o:hrstd="t" o:hr="t" fillcolor="#a0a0a0" stroked="f"/>
         </w:pict>
       </w:r>
     </w:p>
@@ -1249,517 +1646,710 @@
           <w:bCs/>
         </w:rPr>
         <w:lastRenderedPageBreak/>
-        <w:t>Step 8: Create Custom Wazuh Detection Rules</w:t>
-      </w:r>
-    </w:p>
-    <w:p>
-      <w:pPr>
-        <w:pBdr>
-          <w:bottom w:val="single" w:sz="12" w:space="1" w:color="auto"/>
-        </w:pBdr>
-      </w:pPr>
-      <w:r>
-        <w:t>Edit the local rules:</w:t>
-      </w:r>
-    </w:p>
-    <w:p>
-      <w:pPr>
-        <w:pBdr>
-          <w:bottom w:val="single" w:sz="12" w:space="1" w:color="auto"/>
-        </w:pBdr>
-      </w:pPr>
-      <w:r>
-        <w:t>sudo nano /var/ossec/etc/rules/local_rules.xml</w:t>
-      </w:r>
-    </w:p>
-    <w:p>
-      <w:pPr>
-        <w:pBdr>
-          <w:bottom w:val="single" w:sz="12" w:space="1" w:color="auto"/>
-        </w:pBdr>
-      </w:pPr>
-      <w:r>
-        <w:t xml:space="preserve">Add the following rules </w:t>
-      </w:r>
+        <w:t xml:space="preserve">Step 8: Create Custom </w:t>
+      </w:r>
+      <w:proofErr w:type="spellStart"/>
       <w:r>
         <w:rPr>
           <w:b/>
           <w:bCs/>
         </w:rPr>
-        <w:t>after the existing rules and before the final &lt;/group&gt;</w:t>
-      </w:r>
-      <w:r>
-        <w:t>.</w:t>
-      </w:r>
-    </w:p>
-    <w:p>
-      <w:pPr>
-        <w:pBdr>
-          <w:bottom w:val="single" w:sz="12" w:space="1" w:color="auto"/>
-        </w:pBdr>
-      </w:pPr>
-      <w:r>
-        <w:t>&lt;rule id="100500" level="5"&gt;</w:t>
-      </w:r>
-    </w:p>
-    <w:p>
-      <w:pPr>
-        <w:pBdr>
-          <w:bottom w:val="single" w:sz="12" w:space="1" w:color="auto"/>
-        </w:pBdr>
-      </w:pPr>
-      <w:r>
-        <w:t xml:space="preserve">    &lt;decoded_as&gt;json&lt;/decoded_as&gt;</w:t>
-      </w:r>
-    </w:p>
-    <w:p>
-      <w:pPr>
-        <w:pBdr>
-          <w:bottom w:val="single" w:sz="12" w:space="1" w:color="auto"/>
-        </w:pBdr>
-      </w:pPr>
-      <w:r>
-        <w:t xml:space="preserve">    &lt;field name="eventid"&gt;cowrie.login.success&lt;/field&gt;</w:t>
-      </w:r>
-    </w:p>
-    <w:p>
-      <w:pPr>
-        <w:pBdr>
-          <w:bottom w:val="single" w:sz="12" w:space="1" w:color="auto"/>
-        </w:pBdr>
-      </w:pPr>
-      <w:r>
-        <w:t xml:space="preserve">    &lt;description&gt;Cowrie Successful Login&lt;/description&gt;</w:t>
-      </w:r>
-    </w:p>
-    <w:p>
-      <w:pPr>
-        <w:pBdr>
-          <w:bottom w:val="single" w:sz="12" w:space="1" w:color="auto"/>
-        </w:pBdr>
-      </w:pPr>
-      <w:r>
-        <w:t xml:space="preserve">    &lt;mitre&gt;</w:t>
-      </w:r>
-    </w:p>
-    <w:p>
-      <w:pPr>
-        <w:pBdr>
-          <w:bottom w:val="single" w:sz="12" w:space="1" w:color="auto"/>
-        </w:pBdr>
-      </w:pPr>
-      <w:r>
-        <w:t xml:space="preserve">        &lt;id&gt;T1110&lt;/id&gt;</w:t>
-      </w:r>
-    </w:p>
-    <w:p>
-      <w:pPr>
-        <w:pBdr>
-          <w:bottom w:val="single" w:sz="12" w:space="1" w:color="auto"/>
-        </w:pBdr>
-      </w:pPr>
-      <w:r>
-        <w:t xml:space="preserve">    &lt;/mitre&gt;</w:t>
-      </w:r>
-    </w:p>
-    <w:p>
-      <w:pPr>
-        <w:pBdr>
-          <w:bottom w:val="single" w:sz="12" w:space="1" w:color="auto"/>
-        </w:pBdr>
-      </w:pPr>
-      <w:r>
-        <w:t xml:space="preserve">    &lt;group&gt;cowrie,honeypot,authentication,&lt;/group&gt;</w:t>
-      </w:r>
-    </w:p>
-    <w:p>
-      <w:pPr>
-        <w:pBdr>
-          <w:bottom w:val="single" w:sz="12" w:space="1" w:color="auto"/>
-        </w:pBdr>
-      </w:pPr>
-      <w:r>
-        <w:t>&lt;/rule&gt;</w:t>
-      </w:r>
-    </w:p>
-    <w:p>
-      <w:pPr>
-        <w:pBdr>
-          <w:bottom w:val="single" w:sz="12" w:space="1" w:color="auto"/>
-        </w:pBdr>
-      </w:pPr>
-    </w:p>
-    <w:p>
-      <w:pPr>
-        <w:pBdr>
-          <w:bottom w:val="single" w:sz="12" w:space="1" w:color="auto"/>
-        </w:pBdr>
-      </w:pPr>
-      <w:r>
-        <w:t>&lt;rule id="100501" level="8"&gt;</w:t>
-      </w:r>
-    </w:p>
-    <w:p>
-      <w:pPr>
-        <w:pBdr>
-          <w:bottom w:val="single" w:sz="12" w:space="1" w:color="auto"/>
-        </w:pBdr>
-      </w:pPr>
-      <w:r>
-        <w:t xml:space="preserve">    &lt;decoded_as&gt;json&lt;/decoded_as&gt;</w:t>
-      </w:r>
-    </w:p>
-    <w:p>
-      <w:pPr>
-        <w:pBdr>
-          <w:bottom w:val="single" w:sz="12" w:space="1" w:color="auto"/>
-        </w:pBdr>
-      </w:pPr>
-      <w:r>
-        <w:t xml:space="preserve">    &lt;field name="eventid"&gt;cowrie.command.input&lt;/field&gt;</w:t>
-      </w:r>
-    </w:p>
-    <w:p>
-      <w:pPr>
-        <w:pBdr>
-          <w:bottom w:val="single" w:sz="12" w:space="1" w:color="auto"/>
-        </w:pBdr>
-      </w:pPr>
-      <w:r>
-        <w:t xml:space="preserve">    &lt;description&gt;Cowrie Command Executed&lt;/description&gt;</w:t>
-      </w:r>
-    </w:p>
-    <w:p>
-      <w:pPr>
-        <w:pBdr>
-          <w:bottom w:val="single" w:sz="12" w:space="1" w:color="auto"/>
-        </w:pBdr>
-      </w:pPr>
-      <w:r>
-        <w:t xml:space="preserve">    &lt;mitre&gt;</w:t>
-      </w:r>
-    </w:p>
-    <w:p>
-      <w:pPr>
-        <w:pBdr>
-          <w:bottom w:val="single" w:sz="12" w:space="1" w:color="auto"/>
-        </w:pBdr>
-      </w:pPr>
-      <w:r>
-        <w:t xml:space="preserve">        &lt;id&gt;T1059&lt;/id&gt;</w:t>
-      </w:r>
-    </w:p>
-    <w:p>
-      <w:pPr>
-        <w:pBdr>
-          <w:bottom w:val="single" w:sz="12" w:space="1" w:color="auto"/>
-        </w:pBdr>
-      </w:pPr>
-      <w:r>
-        <w:t xml:space="preserve">    &lt;/mitre&gt;</w:t>
-      </w:r>
-    </w:p>
-    <w:p>
-      <w:pPr>
-        <w:pBdr>
-          <w:bottom w:val="single" w:sz="12" w:space="1" w:color="auto"/>
-        </w:pBdr>
-      </w:pPr>
-      <w:r>
-        <w:t xml:space="preserve">    &lt;group&gt;cowrie,honeypot,command_execution,&lt;/group&gt;</w:t>
-      </w:r>
-    </w:p>
-    <w:p>
-      <w:pPr>
-        <w:pBdr>
-          <w:bottom w:val="single" w:sz="12" w:space="1" w:color="auto"/>
-        </w:pBdr>
-      </w:pPr>
-      <w:r>
-        <w:t>&lt;/rule&gt;</w:t>
-      </w:r>
-    </w:p>
-    <w:p>
-      <w:pPr>
-        <w:pBdr>
-          <w:bottom w:val="single" w:sz="12" w:space="1" w:color="auto"/>
-        </w:pBdr>
-      </w:pPr>
-    </w:p>
-    <w:p>
-      <w:pPr>
-        <w:pBdr>
-          <w:bottom w:val="single" w:sz="12" w:space="1" w:color="auto"/>
-        </w:pBdr>
-      </w:pPr>
-      <w:r>
-        <w:t>&lt;rule id="100502" level="3"&gt;</w:t>
-      </w:r>
-    </w:p>
-    <w:p>
-      <w:pPr>
-        <w:pBdr>
-          <w:bottom w:val="single" w:sz="12" w:space="1" w:color="auto"/>
-        </w:pBdr>
-      </w:pPr>
-      <w:r>
-        <w:t xml:space="preserve">    &lt;decoded_as&gt;json&lt;/decoded_as&gt;</w:t>
-      </w:r>
-    </w:p>
-    <w:p>
-      <w:pPr>
-        <w:pBdr>
-          <w:bottom w:val="single" w:sz="12" w:space="1" w:color="auto"/>
-        </w:pBdr>
-      </w:pPr>
-      <w:r>
-        <w:t xml:space="preserve">    &lt;field name="eventid"&gt;cowrie.session.closed&lt;/field&gt;</w:t>
-      </w:r>
-    </w:p>
-    <w:p>
-      <w:pPr>
-        <w:pBdr>
-          <w:bottom w:val="single" w:sz="12" w:space="1" w:color="auto"/>
-        </w:pBdr>
-      </w:pPr>
-      <w:r>
-        <w:t xml:space="preserve">    &lt;description&gt;Cowrie Session Closed&lt;/description&gt;</w:t>
-      </w:r>
-    </w:p>
-    <w:p>
-      <w:pPr>
-        <w:pBdr>
-          <w:bottom w:val="single" w:sz="12" w:space="1" w:color="auto"/>
-        </w:pBdr>
-      </w:pPr>
-      <w:r>
-        <w:lastRenderedPageBreak/>
-        <w:t xml:space="preserve">    &lt;group&gt;cowrie,honeypot,session,&lt;/group&gt;</w:t>
-      </w:r>
-    </w:p>
-    <w:p>
-      <w:pPr>
-        <w:pBdr>
-          <w:bottom w:val="single" w:sz="12" w:space="1" w:color="auto"/>
-        </w:pBdr>
-      </w:pPr>
-      <w:r>
-        <w:t>&lt;/rule&gt;</w:t>
-      </w:r>
-    </w:p>
-    <w:p>
-      <w:pPr>
-        <w:pBdr>
-          <w:bottom w:val="single" w:sz="12" w:space="1" w:color="auto"/>
-        </w:pBdr>
-      </w:pPr>
-    </w:p>
-    <w:p>
-      <w:pPr>
-        <w:pBdr>
-          <w:bottom w:val="single" w:sz="12" w:space="1" w:color="auto"/>
-        </w:pBdr>
-      </w:pPr>
-      <w:r>
-        <w:t>&lt;rule id="100503" level="5"&gt;</w:t>
-      </w:r>
-    </w:p>
-    <w:p>
-      <w:pPr>
-        <w:pBdr>
-          <w:bottom w:val="single" w:sz="12" w:space="1" w:color="auto"/>
-        </w:pBdr>
-      </w:pPr>
-      <w:r>
-        <w:t xml:space="preserve">    &lt;decoded_as&gt;json&lt;/decoded_as&gt;</w:t>
-      </w:r>
-    </w:p>
-    <w:p>
-      <w:pPr>
-        <w:pBdr>
-          <w:bottom w:val="single" w:sz="12" w:space="1" w:color="auto"/>
-        </w:pBdr>
-      </w:pPr>
-      <w:r>
-        <w:t xml:space="preserve">    &lt;field name="eventid"&gt;cowrie.client.version&lt;/field&gt;</w:t>
-      </w:r>
-    </w:p>
-    <w:p>
-      <w:pPr>
-        <w:pBdr>
-          <w:bottom w:val="single" w:sz="12" w:space="1" w:color="auto"/>
-        </w:pBdr>
-      </w:pPr>
-      <w:r>
-        <w:t xml:space="preserve">    &lt;description&gt;SSH Client Connected to Cowrie&lt;/description&gt;</w:t>
-      </w:r>
-    </w:p>
-    <w:p>
-      <w:pPr>
-        <w:pBdr>
-          <w:bottom w:val="single" w:sz="12" w:space="1" w:color="auto"/>
-        </w:pBdr>
-      </w:pPr>
-      <w:r>
-        <w:t xml:space="preserve">    &lt;group&gt;cowrie,honeypot,ssh,&lt;/group&gt;</w:t>
-      </w:r>
-    </w:p>
-    <w:p>
-      <w:pPr>
-        <w:pBdr>
-          <w:bottom w:val="single" w:sz="12" w:space="1" w:color="auto"/>
-        </w:pBdr>
-      </w:pPr>
-      <w:r>
-        <w:t>&lt;/rule&gt;</w:t>
-      </w:r>
-    </w:p>
-    <w:p>
-      <w:pPr>
-        <w:pBdr>
-          <w:bottom w:val="single" w:sz="12" w:space="1" w:color="auto"/>
-        </w:pBdr>
-      </w:pPr>
+        <w:t>Wazuh</w:t>
+      </w:r>
+      <w:proofErr w:type="spellEnd"/>
       <w:r>
         <w:rPr>
           <w:b/>
           <w:bCs/>
         </w:rPr>
-        <w:t>Note:</w:t>
-      </w:r>
-      <w:r>
-        <w:t xml:space="preserve"> Do </w:t>
+        <w:t xml:space="preserve"> Detection Rules</w:t>
+      </w:r>
+    </w:p>
+    <w:p>
+      <w:pPr>
+        <w:pBdr>
+          <w:bottom w:val="single" w:sz="12" w:space="1" w:color="auto"/>
+        </w:pBdr>
+      </w:pPr>
+      <w:r>
+        <w:t>Edit the local rules:</w:t>
+      </w:r>
+    </w:p>
+    <w:p>
+      <w:pPr>
+        <w:pBdr>
+          <w:bottom w:val="single" w:sz="12" w:space="1" w:color="auto"/>
+        </w:pBdr>
+      </w:pPr>
+      <w:proofErr w:type="spellStart"/>
+      <w:r>
+        <w:t>sudo</w:t>
+      </w:r>
+      <w:proofErr w:type="spellEnd"/>
+      <w:r>
+        <w:t xml:space="preserve"> nano /var/</w:t>
+      </w:r>
+      <w:proofErr w:type="spellStart"/>
+      <w:r>
+        <w:t>ossec</w:t>
+      </w:r>
+      <w:proofErr w:type="spellEnd"/>
+      <w:r>
+        <w:t>/etc/rules/local_rules.xml</w:t>
+      </w:r>
+    </w:p>
+    <w:p>
+      <w:pPr>
+        <w:pBdr>
+          <w:bottom w:val="single" w:sz="12" w:space="1" w:color="auto"/>
+        </w:pBdr>
+      </w:pPr>
+      <w:r>
+        <w:t xml:space="preserve">Add the following rules </w:t>
       </w:r>
       <w:r>
         <w:rPr>
           <w:b/>
           <w:bCs/>
         </w:rPr>
-        <w:t>not</w:t>
-      </w:r>
-      <w:r>
-        <w:t xml:space="preserve"> create an additional &lt;group name="cowrie,honeypot,"&gt; wrapper. Only add the &lt;rule&gt; entries inside the existing group in local_rules.xml.</w:t>
-      </w:r>
-    </w:p>
-    <w:p>
-      <w:pPr>
-        <w:pBdr>
-          <w:bottom w:val="single" w:sz="12" w:space="1" w:color="auto"/>
-        </w:pBdr>
-      </w:pPr>
-      <w:r>
-        <w:pict w14:anchorId="1C3B5C60">
-          <v:rect id="_x0000_i1092" style="width:0;height:1.5pt" o:hralign="center" o:hrstd="t" o:hr="t" fillcolor="#a0a0a0" stroked="f"/>
-        </w:pict>
-      </w:r>
-    </w:p>
-    <w:p>
-      <w:pPr>
-        <w:pBdr>
-          <w:bottom w:val="single" w:sz="12" w:space="1" w:color="auto"/>
-        </w:pBdr>
+        <w:t>after the existing rules and before the final &lt;/group&gt;</w:t>
+      </w:r>
+      <w:r>
+        <w:t>.</w:t>
+      </w:r>
+    </w:p>
+    <w:p>
+      <w:pPr>
+        <w:pBdr>
+          <w:bottom w:val="single" w:sz="12" w:space="1" w:color="auto"/>
+        </w:pBdr>
+      </w:pPr>
+      <w:r>
+        <w:t>&lt;rule id="100500" level="5"&gt;</w:t>
+      </w:r>
+    </w:p>
+    <w:p>
+      <w:pPr>
+        <w:pBdr>
+          <w:bottom w:val="single" w:sz="12" w:space="1" w:color="auto"/>
+        </w:pBdr>
+      </w:pPr>
+      <w:r>
+        <w:t xml:space="preserve">    &lt;</w:t>
+      </w:r>
+      <w:proofErr w:type="spellStart"/>
+      <w:r>
+        <w:t>decoded_as</w:t>
+      </w:r>
+      <w:proofErr w:type="spellEnd"/>
+      <w:r>
+        <w:t>&gt;</w:t>
+      </w:r>
+      <w:proofErr w:type="spellStart"/>
+      <w:r>
+        <w:t>json</w:t>
+      </w:r>
+      <w:proofErr w:type="spellEnd"/>
+      <w:r>
+        <w:t>&lt;/</w:t>
+      </w:r>
+      <w:proofErr w:type="spellStart"/>
+      <w:r>
+        <w:t>decoded_as</w:t>
+      </w:r>
+      <w:proofErr w:type="spellEnd"/>
+      <w:r>
+        <w:t>&gt;</w:t>
+      </w:r>
+    </w:p>
+    <w:p>
+      <w:pPr>
+        <w:pBdr>
+          <w:bottom w:val="single" w:sz="12" w:space="1" w:color="auto"/>
+        </w:pBdr>
+      </w:pPr>
+      <w:r>
+        <w:t xml:space="preserve">    &lt;field name="</w:t>
+      </w:r>
+      <w:proofErr w:type="spellStart"/>
+      <w:r>
+        <w:t>eventid</w:t>
+      </w:r>
+      <w:proofErr w:type="spellEnd"/>
+      <w:r>
+        <w:t>"&gt;</w:t>
+      </w:r>
+      <w:proofErr w:type="spellStart"/>
+      <w:r>
+        <w:t>cowrie.</w:t>
+      </w:r>
+      <w:proofErr w:type="gramStart"/>
+      <w:r>
+        <w:t>login.success</w:t>
+      </w:r>
+      <w:proofErr w:type="spellEnd"/>
+      <w:proofErr w:type="gramEnd"/>
+      <w:r>
+        <w:t>&lt;/field&gt;</w:t>
+      </w:r>
+    </w:p>
+    <w:p>
+      <w:pPr>
+        <w:pBdr>
+          <w:bottom w:val="single" w:sz="12" w:space="1" w:color="auto"/>
+        </w:pBdr>
+      </w:pPr>
+      <w:r>
+        <w:t xml:space="preserve">    &lt;description&gt;Cowrie Successful Login&lt;/description&gt;</w:t>
+      </w:r>
+    </w:p>
+    <w:p>
+      <w:pPr>
+        <w:pBdr>
+          <w:bottom w:val="single" w:sz="12" w:space="1" w:color="auto"/>
+        </w:pBdr>
+      </w:pPr>
+      <w:r>
+        <w:t xml:space="preserve">    &lt;mitre&gt;</w:t>
+      </w:r>
+    </w:p>
+    <w:p>
+      <w:pPr>
+        <w:pBdr>
+          <w:bottom w:val="single" w:sz="12" w:space="1" w:color="auto"/>
+        </w:pBdr>
+      </w:pPr>
+      <w:r>
+        <w:t xml:space="preserve">        &lt;id&gt;T1110&lt;/id&gt;</w:t>
+      </w:r>
+    </w:p>
+    <w:p>
+      <w:pPr>
+        <w:pBdr>
+          <w:bottom w:val="single" w:sz="12" w:space="1" w:color="auto"/>
+        </w:pBdr>
+      </w:pPr>
+      <w:r>
+        <w:t xml:space="preserve">    &lt;/mitre&gt;</w:t>
+      </w:r>
+    </w:p>
+    <w:p>
+      <w:pPr>
+        <w:pBdr>
+          <w:bottom w:val="single" w:sz="12" w:space="1" w:color="auto"/>
+        </w:pBdr>
+      </w:pPr>
+      <w:r>
+        <w:t xml:space="preserve">    &lt;group&gt;</w:t>
+      </w:r>
+      <w:proofErr w:type="spellStart"/>
+      <w:proofErr w:type="gramStart"/>
+      <w:r>
+        <w:t>cowrie,honeypot</w:t>
+      </w:r>
+      <w:proofErr w:type="gramEnd"/>
+      <w:r>
+        <w:t>,</w:t>
+      </w:r>
+      <w:proofErr w:type="gramStart"/>
+      <w:r>
+        <w:t>authentication</w:t>
+      </w:r>
+      <w:proofErr w:type="spellEnd"/>
+      <w:r>
+        <w:t>,&lt;</w:t>
+      </w:r>
+      <w:proofErr w:type="gramEnd"/>
+      <w:r>
+        <w:t>/group&gt;</w:t>
+      </w:r>
+    </w:p>
+    <w:p>
+      <w:pPr>
+        <w:pBdr>
+          <w:bottom w:val="single" w:sz="12" w:space="1" w:color="auto"/>
+        </w:pBdr>
+      </w:pPr>
+      <w:r>
+        <w:t>&lt;/rule&gt;</w:t>
+      </w:r>
+    </w:p>
+    <w:p>
+      <w:pPr>
+        <w:pBdr>
+          <w:bottom w:val="single" w:sz="12" w:space="1" w:color="auto"/>
+        </w:pBdr>
+      </w:pPr>
+    </w:p>
+    <w:p>
+      <w:pPr>
+        <w:pBdr>
+          <w:bottom w:val="single" w:sz="12" w:space="1" w:color="auto"/>
+        </w:pBdr>
+      </w:pPr>
+      <w:r>
+        <w:t>&lt;rule id="100501" level="8"&gt;</w:t>
+      </w:r>
+    </w:p>
+    <w:p>
+      <w:pPr>
+        <w:pBdr>
+          <w:bottom w:val="single" w:sz="12" w:space="1" w:color="auto"/>
+        </w:pBdr>
+      </w:pPr>
+      <w:r>
+        <w:t xml:space="preserve">    &lt;</w:t>
+      </w:r>
+      <w:proofErr w:type="spellStart"/>
+      <w:r>
+        <w:t>decoded_as</w:t>
+      </w:r>
+      <w:proofErr w:type="spellEnd"/>
+      <w:r>
+        <w:t>&gt;</w:t>
+      </w:r>
+      <w:proofErr w:type="spellStart"/>
+      <w:r>
+        <w:t>json</w:t>
+      </w:r>
+      <w:proofErr w:type="spellEnd"/>
+      <w:r>
+        <w:t>&lt;/</w:t>
+      </w:r>
+      <w:proofErr w:type="spellStart"/>
+      <w:r>
+        <w:t>decoded_as</w:t>
+      </w:r>
+      <w:proofErr w:type="spellEnd"/>
+      <w:r>
+        <w:t>&gt;</w:t>
+      </w:r>
+    </w:p>
+    <w:p>
+      <w:pPr>
+        <w:pBdr>
+          <w:bottom w:val="single" w:sz="12" w:space="1" w:color="auto"/>
+        </w:pBdr>
+      </w:pPr>
+      <w:r>
+        <w:t xml:space="preserve">    &lt;field name="</w:t>
+      </w:r>
+      <w:proofErr w:type="spellStart"/>
+      <w:r>
+        <w:t>eventid</w:t>
+      </w:r>
+      <w:proofErr w:type="spellEnd"/>
+      <w:r>
+        <w:t>"&gt;</w:t>
+      </w:r>
+      <w:proofErr w:type="spellStart"/>
+      <w:proofErr w:type="gramStart"/>
+      <w:r>
+        <w:t>cowrie.command</w:t>
+      </w:r>
+      <w:proofErr w:type="gramEnd"/>
+      <w:r>
+        <w:t>.input</w:t>
+      </w:r>
+      <w:proofErr w:type="spellEnd"/>
+      <w:r>
+        <w:t>&lt;/field&gt;</w:t>
+      </w:r>
+    </w:p>
+    <w:p>
+      <w:pPr>
+        <w:pBdr>
+          <w:bottom w:val="single" w:sz="12" w:space="1" w:color="auto"/>
+        </w:pBdr>
+      </w:pPr>
+      <w:r>
+        <w:t xml:space="preserve">    &lt;description&gt;Cowrie Command Executed&lt;/description&gt;</w:t>
+      </w:r>
+    </w:p>
+    <w:p>
+      <w:pPr>
+        <w:pBdr>
+          <w:bottom w:val="single" w:sz="12" w:space="1" w:color="auto"/>
+        </w:pBdr>
+      </w:pPr>
+      <w:r>
+        <w:t xml:space="preserve">    &lt;mitre&gt;</w:t>
+      </w:r>
+    </w:p>
+    <w:p>
+      <w:pPr>
+        <w:pBdr>
+          <w:bottom w:val="single" w:sz="12" w:space="1" w:color="auto"/>
+        </w:pBdr>
+      </w:pPr>
+      <w:r>
+        <w:t xml:space="preserve">        &lt;id&gt;T1059&lt;/id&gt;</w:t>
+      </w:r>
+    </w:p>
+    <w:p>
+      <w:pPr>
+        <w:pBdr>
+          <w:bottom w:val="single" w:sz="12" w:space="1" w:color="auto"/>
+        </w:pBdr>
+      </w:pPr>
+      <w:r>
+        <w:t xml:space="preserve">    &lt;/mitre&gt;</w:t>
+      </w:r>
+    </w:p>
+    <w:p>
+      <w:pPr>
+        <w:pBdr>
+          <w:bottom w:val="single" w:sz="12" w:space="1" w:color="auto"/>
+        </w:pBdr>
+      </w:pPr>
+      <w:r>
+        <w:t xml:space="preserve">    &lt;group&gt;</w:t>
+      </w:r>
+      <w:proofErr w:type="spellStart"/>
+      <w:proofErr w:type="gramStart"/>
+      <w:r>
+        <w:t>cowrie,honeypot</w:t>
+      </w:r>
+      <w:proofErr w:type="gramEnd"/>
+      <w:r>
+        <w:t>,command_</w:t>
+      </w:r>
+      <w:proofErr w:type="gramStart"/>
+      <w:r>
+        <w:t>execution</w:t>
+      </w:r>
+      <w:proofErr w:type="spellEnd"/>
+      <w:r>
+        <w:t>,&lt;</w:t>
+      </w:r>
+      <w:proofErr w:type="gramEnd"/>
+      <w:r>
+        <w:t>/group&gt;</w:t>
+      </w:r>
+    </w:p>
+    <w:p>
+      <w:pPr>
+        <w:pBdr>
+          <w:bottom w:val="single" w:sz="12" w:space="1" w:color="auto"/>
+        </w:pBdr>
+      </w:pPr>
+      <w:r>
+        <w:t>&lt;/rule&gt;</w:t>
+      </w:r>
+    </w:p>
+    <w:p>
+      <w:pPr>
+        <w:pBdr>
+          <w:bottom w:val="single" w:sz="12" w:space="1" w:color="auto"/>
+        </w:pBdr>
+      </w:pPr>
+    </w:p>
+    <w:p>
+      <w:pPr>
+        <w:pBdr>
+          <w:bottom w:val="single" w:sz="12" w:space="1" w:color="auto"/>
+        </w:pBdr>
+      </w:pPr>
+      <w:r>
+        <w:t>&lt;rule id="100502" level="3"&gt;</w:t>
+      </w:r>
+    </w:p>
+    <w:p>
+      <w:pPr>
+        <w:pBdr>
+          <w:bottom w:val="single" w:sz="12" w:space="1" w:color="auto"/>
+        </w:pBdr>
+      </w:pPr>
+      <w:r>
+        <w:t xml:space="preserve">    &lt;</w:t>
+      </w:r>
+      <w:proofErr w:type="spellStart"/>
+      <w:r>
+        <w:t>decoded_as</w:t>
+      </w:r>
+      <w:proofErr w:type="spellEnd"/>
+      <w:r>
+        <w:t>&gt;</w:t>
+      </w:r>
+      <w:proofErr w:type="spellStart"/>
+      <w:r>
+        <w:t>json</w:t>
+      </w:r>
+      <w:proofErr w:type="spellEnd"/>
+      <w:r>
+        <w:t>&lt;/</w:t>
+      </w:r>
+      <w:proofErr w:type="spellStart"/>
+      <w:r>
+        <w:t>decoded_as</w:t>
+      </w:r>
+      <w:proofErr w:type="spellEnd"/>
+      <w:r>
+        <w:t>&gt;</w:t>
+      </w:r>
+    </w:p>
+    <w:p>
+      <w:pPr>
+        <w:pBdr>
+          <w:bottom w:val="single" w:sz="12" w:space="1" w:color="auto"/>
+        </w:pBdr>
+      </w:pPr>
+      <w:r>
+        <w:t xml:space="preserve">    &lt;field name="</w:t>
+      </w:r>
+      <w:proofErr w:type="spellStart"/>
+      <w:r>
+        <w:t>eventid</w:t>
+      </w:r>
+      <w:proofErr w:type="spellEnd"/>
+      <w:r>
+        <w:t>"&gt;</w:t>
+      </w:r>
+      <w:proofErr w:type="spellStart"/>
+      <w:proofErr w:type="gramStart"/>
+      <w:r>
+        <w:t>cowrie.session</w:t>
+      </w:r>
+      <w:proofErr w:type="gramEnd"/>
+      <w:r>
+        <w:t>.closed</w:t>
+      </w:r>
+      <w:proofErr w:type="spellEnd"/>
+      <w:r>
+        <w:t>&lt;/field&gt;</w:t>
+      </w:r>
+    </w:p>
+    <w:p>
+      <w:pPr>
+        <w:pBdr>
+          <w:bottom w:val="single" w:sz="12" w:space="1" w:color="auto"/>
+        </w:pBdr>
+      </w:pPr>
+      <w:r>
+        <w:t xml:space="preserve">    &lt;description&gt;Cowrie Session Closed&lt;/description&gt;</w:t>
+      </w:r>
+    </w:p>
+    <w:p>
+      <w:pPr>
+        <w:pBdr>
+          <w:bottom w:val="single" w:sz="12" w:space="1" w:color="auto"/>
+        </w:pBdr>
+      </w:pPr>
+      <w:r>
+        <w:lastRenderedPageBreak/>
+        <w:t xml:space="preserve">    &lt;group&gt;</w:t>
+      </w:r>
+      <w:proofErr w:type="spellStart"/>
+      <w:proofErr w:type="gramStart"/>
+      <w:r>
+        <w:t>cowrie,honeypot</w:t>
+      </w:r>
+      <w:proofErr w:type="gramEnd"/>
+      <w:r>
+        <w:t>,</w:t>
+      </w:r>
+      <w:proofErr w:type="gramStart"/>
+      <w:r>
+        <w:t>session</w:t>
+      </w:r>
+      <w:proofErr w:type="spellEnd"/>
+      <w:r>
+        <w:t>,&lt;</w:t>
+      </w:r>
+      <w:proofErr w:type="gramEnd"/>
+      <w:r>
+        <w:t>/group&gt;</w:t>
+      </w:r>
+    </w:p>
+    <w:p>
+      <w:pPr>
+        <w:pBdr>
+          <w:bottom w:val="single" w:sz="12" w:space="1" w:color="auto"/>
+        </w:pBdr>
+      </w:pPr>
+      <w:r>
+        <w:t>&lt;/rule&gt;</w:t>
+      </w:r>
+    </w:p>
+    <w:p>
+      <w:pPr>
+        <w:pBdr>
+          <w:bottom w:val="single" w:sz="12" w:space="1" w:color="auto"/>
+        </w:pBdr>
+      </w:pPr>
+    </w:p>
+    <w:p>
+      <w:pPr>
+        <w:pBdr>
+          <w:bottom w:val="single" w:sz="12" w:space="1" w:color="auto"/>
+        </w:pBdr>
+      </w:pPr>
+      <w:r>
+        <w:t>&lt;rule id="100503" level="5"&gt;</w:t>
+      </w:r>
+    </w:p>
+    <w:p>
+      <w:pPr>
+        <w:pBdr>
+          <w:bottom w:val="single" w:sz="12" w:space="1" w:color="auto"/>
+        </w:pBdr>
+      </w:pPr>
+      <w:r>
+        <w:t xml:space="preserve">    &lt;</w:t>
+      </w:r>
+      <w:proofErr w:type="spellStart"/>
+      <w:r>
+        <w:t>decoded_as</w:t>
+      </w:r>
+      <w:proofErr w:type="spellEnd"/>
+      <w:r>
+        <w:t>&gt;</w:t>
+      </w:r>
+      <w:proofErr w:type="spellStart"/>
+      <w:r>
+        <w:t>json</w:t>
+      </w:r>
+      <w:proofErr w:type="spellEnd"/>
+      <w:r>
+        <w:t>&lt;/</w:t>
+      </w:r>
+      <w:proofErr w:type="spellStart"/>
+      <w:r>
+        <w:t>decoded_as</w:t>
+      </w:r>
+      <w:proofErr w:type="spellEnd"/>
+      <w:r>
+        <w:t>&gt;</w:t>
+      </w:r>
+    </w:p>
+    <w:p>
+      <w:pPr>
+        <w:pBdr>
+          <w:bottom w:val="single" w:sz="12" w:space="1" w:color="auto"/>
+        </w:pBdr>
+      </w:pPr>
+      <w:r>
+        <w:t xml:space="preserve">    &lt;field name="</w:t>
+      </w:r>
+      <w:proofErr w:type="spellStart"/>
+      <w:r>
+        <w:t>eventid</w:t>
+      </w:r>
+      <w:proofErr w:type="spellEnd"/>
+      <w:r>
+        <w:t>"&gt;</w:t>
+      </w:r>
+      <w:proofErr w:type="spellStart"/>
+      <w:proofErr w:type="gramStart"/>
+      <w:r>
+        <w:t>cowrie.client</w:t>
+      </w:r>
+      <w:proofErr w:type="gramEnd"/>
+      <w:r>
+        <w:t>.version</w:t>
+      </w:r>
+      <w:proofErr w:type="spellEnd"/>
+      <w:r>
+        <w:t>&lt;/field&gt;</w:t>
+      </w:r>
+    </w:p>
+    <w:p>
+      <w:pPr>
+        <w:pBdr>
+          <w:bottom w:val="single" w:sz="12" w:space="1" w:color="auto"/>
+        </w:pBdr>
+      </w:pPr>
+      <w:r>
+        <w:t xml:space="preserve">    &lt;description&gt;SSH Client Connected to Cowrie&lt;/description&gt;</w:t>
+      </w:r>
+    </w:p>
+    <w:p>
+      <w:pPr>
+        <w:pBdr>
+          <w:bottom w:val="single" w:sz="12" w:space="1" w:color="auto"/>
+        </w:pBdr>
+      </w:pPr>
+      <w:r>
+        <w:t xml:space="preserve">    &lt;group&gt;</w:t>
+      </w:r>
+      <w:proofErr w:type="spellStart"/>
+      <w:proofErr w:type="gramStart"/>
+      <w:r>
+        <w:t>cowrie,honeypot</w:t>
+      </w:r>
+      <w:proofErr w:type="gramEnd"/>
+      <w:r>
+        <w:t>,</w:t>
+      </w:r>
+      <w:proofErr w:type="gramStart"/>
+      <w:r>
+        <w:t>ssh</w:t>
+      </w:r>
+      <w:proofErr w:type="spellEnd"/>
+      <w:r>
+        <w:t>,&lt;</w:t>
+      </w:r>
+      <w:proofErr w:type="gramEnd"/>
+      <w:r>
+        <w:t>/group&gt;</w:t>
+      </w:r>
+    </w:p>
+    <w:p>
+      <w:pPr>
+        <w:pBdr>
+          <w:bottom w:val="single" w:sz="12" w:space="1" w:color="auto"/>
+        </w:pBdr>
+      </w:pPr>
+      <w:r>
+        <w:t>&lt;/rule&gt;</w:t>
+      </w:r>
+    </w:p>
+    <w:p>
+      <w:pPr>
+        <w:pBdr>
+          <w:bottom w:val="single" w:sz="12" w:space="1" w:color="auto"/>
+        </w:pBdr>
+      </w:pPr>
+      <w:r>
         <w:rPr>
           <w:b/>
           <w:bCs/>
         </w:rPr>
-      </w:pPr>
+        <w:t>Note:</w:t>
+      </w:r>
+      <w:r>
+        <w:t xml:space="preserve"> Do </w:t>
+      </w:r>
       <w:r>
         <w:rPr>
           <w:b/>
           <w:bCs/>
         </w:rPr>
-        <w:t>Step 9: Validate the Configuration</w:t>
-      </w:r>
-    </w:p>
-    <w:p>
-      <w:pPr>
-        <w:pBdr>
-          <w:bottom w:val="single" w:sz="12" w:space="1" w:color="auto"/>
-        </w:pBdr>
-      </w:pPr>
-      <w:r>
-        <w:t>Run:</w:t>
-      </w:r>
-    </w:p>
-    <w:p>
-      <w:pPr>
-        <w:pBdr>
-          <w:bottom w:val="single" w:sz="12" w:space="1" w:color="auto"/>
-        </w:pBdr>
-      </w:pPr>
-      <w:r>
-        <w:t>sudo /var/ossec/bin/wazuh-logtest</w:t>
-      </w:r>
-    </w:p>
-    <w:p>
-      <w:pPr>
-        <w:pBdr>
-          <w:bottom w:val="single" w:sz="12" w:space="1" w:color="auto"/>
-        </w:pBdr>
-      </w:pPr>
-      <w:r>
-        <w:t>Expected output:</w:t>
-      </w:r>
-    </w:p>
-    <w:p>
-      <w:pPr>
-        <w:pBdr>
-          <w:bottom w:val="single" w:sz="12" w:space="1" w:color="auto"/>
-        </w:pBdr>
-      </w:pPr>
-      <w:r>
-        <w:t>Starting wazuh-logtest v4.12.0</w:t>
-      </w:r>
-    </w:p>
-    <w:p>
-      <w:pPr>
-        <w:pBdr>
-          <w:bottom w:val="single" w:sz="12" w:space="1" w:color="auto"/>
-        </w:pBdr>
-      </w:pPr>
-      <w:r>
-        <w:t>Type one log per line</w:t>
-      </w:r>
-    </w:p>
-    <w:p>
-      <w:pPr>
-        <w:pBdr>
-          <w:bottom w:val="single" w:sz="12" w:space="1" w:color="auto"/>
-        </w:pBdr>
-      </w:pPr>
-      <w:r>
-        <w:t>Exit using:</w:t>
-      </w:r>
-    </w:p>
-    <w:p>
-      <w:pPr>
-        <w:pBdr>
-          <w:bottom w:val="single" w:sz="12" w:space="1" w:color="auto"/>
-        </w:pBdr>
-      </w:pPr>
-      <w:r>
-        <w:t>Ctrl + C</w:t>
-      </w:r>
-    </w:p>
-    <w:p>
-      <w:pPr>
-        <w:pBdr>
-          <w:bottom w:val="single" w:sz="12" w:space="1" w:color="auto"/>
-        </w:pBdr>
-      </w:pPr>
-      <w:r>
-        <w:t>This confirms the rule file has no XML configuration errors.</w:t>
-      </w:r>
-    </w:p>
-    <w:p>
-      <w:pPr>
-        <w:pBdr>
-          <w:bottom w:val="single" w:sz="12" w:space="1" w:color="auto"/>
-        </w:pBdr>
-      </w:pPr>
-      <w:r>
-        <w:pict w14:anchorId="2C537E9B">
-          <v:rect id="_x0000_i1093" style="width:0;height:1.5pt" o:hralign="center" o:hrstd="t" o:hr="t" fillcolor="#a0a0a0" stroked="f"/>
+        <w:t>not</w:t>
+      </w:r>
+      <w:r>
+        <w:t xml:space="preserve"> create an additional &lt;group name="</w:t>
+      </w:r>
+      <w:proofErr w:type="spellStart"/>
+      <w:proofErr w:type="gramStart"/>
+      <w:r>
+        <w:t>cowrie,honeypot</w:t>
+      </w:r>
+      <w:proofErr w:type="spellEnd"/>
+      <w:proofErr w:type="gramEnd"/>
+      <w:r>
+        <w:t>,"&gt; wrapper. Only add the &lt;rule&gt; entries inside the existing group in local_rules.xml.</w:t>
+      </w:r>
+    </w:p>
+    <w:p>
+      <w:pPr>
+        <w:pBdr>
+          <w:bottom w:val="single" w:sz="12" w:space="1" w:color="auto"/>
+        </w:pBdr>
+      </w:pPr>
+      <w:r>
+        <w:pict w14:anchorId="1C3B5C60">
+          <v:rect id="_x0000_i1032" style="width:0;height:1.5pt" o:hralign="center" o:hrstd="t" o:hr="t" fillcolor="#a0a0a0" stroked="f"/>
         </w:pict>
       </w:r>
     </w:p>
@@ -1778,17 +2368,190 @@
           <w:b/>
           <w:bCs/>
         </w:rPr>
-        <w:t>Step 10: Restart Wazuh Manager</w:t>
-      </w:r>
-    </w:p>
-    <w:p>
-      <w:pPr>
-        <w:pBdr>
-          <w:bottom w:val="single" w:sz="12" w:space="1" w:color="auto"/>
-        </w:pBdr>
-      </w:pPr>
-      <w:r>
-        <w:t>sudo systemctl restart wazuh-manager</w:t>
+        <w:t>Step 9: Validate the Configuration</w:t>
+      </w:r>
+    </w:p>
+    <w:p>
+      <w:pPr>
+        <w:pBdr>
+          <w:bottom w:val="single" w:sz="12" w:space="1" w:color="auto"/>
+        </w:pBdr>
+      </w:pPr>
+      <w:r>
+        <w:t>Run:</w:t>
+      </w:r>
+    </w:p>
+    <w:p>
+      <w:pPr>
+        <w:pBdr>
+          <w:bottom w:val="single" w:sz="12" w:space="1" w:color="auto"/>
+        </w:pBdr>
+      </w:pPr>
+      <w:proofErr w:type="spellStart"/>
+      <w:r>
+        <w:t>sudo</w:t>
+      </w:r>
+      <w:proofErr w:type="spellEnd"/>
+      <w:r>
+        <w:t xml:space="preserve"> /var/</w:t>
+      </w:r>
+      <w:proofErr w:type="spellStart"/>
+      <w:r>
+        <w:t>ossec</w:t>
+      </w:r>
+      <w:proofErr w:type="spellEnd"/>
+      <w:r>
+        <w:t>/bin/</w:t>
+      </w:r>
+      <w:proofErr w:type="spellStart"/>
+      <w:r>
+        <w:t>wazuh-logtest</w:t>
+      </w:r>
+      <w:proofErr w:type="spellEnd"/>
+    </w:p>
+    <w:p>
+      <w:pPr>
+        <w:pBdr>
+          <w:bottom w:val="single" w:sz="12" w:space="1" w:color="auto"/>
+        </w:pBdr>
+      </w:pPr>
+      <w:r>
+        <w:t>Expected output:</w:t>
+      </w:r>
+    </w:p>
+    <w:p>
+      <w:pPr>
+        <w:pBdr>
+          <w:bottom w:val="single" w:sz="12" w:space="1" w:color="auto"/>
+        </w:pBdr>
+      </w:pPr>
+      <w:r>
+        <w:t xml:space="preserve">Starting </w:t>
+      </w:r>
+      <w:proofErr w:type="spellStart"/>
+      <w:r>
+        <w:t>wazuh-logtest</w:t>
+      </w:r>
+      <w:proofErr w:type="spellEnd"/>
+      <w:r>
+        <w:t xml:space="preserve"> v4.12.0</w:t>
+      </w:r>
+    </w:p>
+    <w:p>
+      <w:pPr>
+        <w:pBdr>
+          <w:bottom w:val="single" w:sz="12" w:space="1" w:color="auto"/>
+        </w:pBdr>
+      </w:pPr>
+      <w:r>
+        <w:t>Type one log per line</w:t>
+      </w:r>
+    </w:p>
+    <w:p>
+      <w:pPr>
+        <w:pBdr>
+          <w:bottom w:val="single" w:sz="12" w:space="1" w:color="auto"/>
+        </w:pBdr>
+      </w:pPr>
+      <w:r>
+        <w:t>Exit using:</w:t>
+      </w:r>
+    </w:p>
+    <w:p>
+      <w:pPr>
+        <w:pBdr>
+          <w:bottom w:val="single" w:sz="12" w:space="1" w:color="auto"/>
+        </w:pBdr>
+      </w:pPr>
+      <w:r>
+        <w:t>Ctrl + C</w:t>
+      </w:r>
+    </w:p>
+    <w:p>
+      <w:pPr>
+        <w:pBdr>
+          <w:bottom w:val="single" w:sz="12" w:space="1" w:color="auto"/>
+        </w:pBdr>
+      </w:pPr>
+      <w:r>
+        <w:t>This confirms the rule file has no XML configuration errors.</w:t>
+      </w:r>
+    </w:p>
+    <w:p>
+      <w:pPr>
+        <w:pBdr>
+          <w:bottom w:val="single" w:sz="12" w:space="1" w:color="auto"/>
+        </w:pBdr>
+      </w:pPr>
+      <w:r>
+        <w:pict w14:anchorId="2C537E9B">
+          <v:rect id="_x0000_i1033" style="width:0;height:1.5pt" o:hralign="center" o:hrstd="t" o:hr="t" fillcolor="#a0a0a0" stroked="f"/>
+        </w:pict>
+      </w:r>
+    </w:p>
+    <w:p>
+      <w:pPr>
+        <w:pBdr>
+          <w:bottom w:val="single" w:sz="12" w:space="1" w:color="auto"/>
+        </w:pBdr>
+        <w:rPr>
+          <w:b/>
+          <w:bCs/>
+        </w:rPr>
+      </w:pPr>
+      <w:r>
+        <w:rPr>
+          <w:b/>
+          <w:bCs/>
+        </w:rPr>
+        <w:t xml:space="preserve">Step 10: Restart </w:t>
+      </w:r>
+      <w:proofErr w:type="spellStart"/>
+      <w:r>
+        <w:rPr>
+          <w:b/>
+          <w:bCs/>
+        </w:rPr>
+        <w:t>Wazuh</w:t>
+      </w:r>
+      <w:proofErr w:type="spellEnd"/>
+      <w:r>
+        <w:rPr>
+          <w:b/>
+          <w:bCs/>
+        </w:rPr>
+        <w:t xml:space="preserve"> Manager</w:t>
+      </w:r>
+    </w:p>
+    <w:p>
+      <w:pPr>
+        <w:pBdr>
+          <w:bottom w:val="single" w:sz="12" w:space="1" w:color="auto"/>
+        </w:pBdr>
+      </w:pPr>
+      <w:proofErr w:type="spellStart"/>
+      <w:r>
+        <w:t>sudo</w:t>
+      </w:r>
+      <w:proofErr w:type="spellEnd"/>
+      <w:r>
+        <w:t xml:space="preserve"> </w:t>
+      </w:r>
+      <w:proofErr w:type="spellStart"/>
+      <w:r>
+        <w:t>systemctl</w:t>
+      </w:r>
+      <w:proofErr w:type="spellEnd"/>
+      <w:r>
+        <w:t xml:space="preserve"> restart </w:t>
+      </w:r>
+      <w:proofErr w:type="spellStart"/>
+      <w:r>
+        <w:t>wazuh</w:t>
+      </w:r>
+      <w:proofErr w:type="spellEnd"/>
+      <w:r>
+        <w:t>-manager</w:t>
       </w:r>
     </w:p>
     <w:p>
@@ -1807,8 +2570,29 @@
           <w:bottom w:val="single" w:sz="12" w:space="1" w:color="auto"/>
         </w:pBdr>
       </w:pPr>
-      <w:r>
-        <w:t>sudo systemctl status wazuh-manager</w:t>
+      <w:proofErr w:type="spellStart"/>
+      <w:r>
+        <w:t>sudo</w:t>
+      </w:r>
+      <w:proofErr w:type="spellEnd"/>
+      <w:r>
+        <w:t xml:space="preserve"> </w:t>
+      </w:r>
+      <w:proofErr w:type="spellStart"/>
+      <w:r>
+        <w:t>systemctl</w:t>
+      </w:r>
+      <w:proofErr w:type="spellEnd"/>
+      <w:r>
+        <w:t xml:space="preserve"> status </w:t>
+      </w:r>
+      <w:proofErr w:type="spellStart"/>
+      <w:r>
+        <w:t>wazuh</w:t>
+      </w:r>
+      <w:proofErr w:type="spellEnd"/>
+      <w:r>
+        <w:t>-manager</w:t>
       </w:r>
     </w:p>
     <w:p>
@@ -1840,7 +2624,7 @@
       <w:r>
         <w:lastRenderedPageBreak/>
         <w:pict w14:anchorId="1A2CCED6">
-          <v:rect id="_x0000_i1094" style="width:0;height:1.5pt" o:hralign="center" o:hrstd="t" o:hr="t" fillcolor="#a0a0a0" stroked="f"/>
+          <v:rect id="_x0000_i1034" style="width:0;height:1.5pt" o:hralign="center" o:hrstd="t" o:hr="t" fillcolor="#a0a0a0" stroked="f"/>
         </w:pict>
       </w:r>
     </w:p>
@@ -1898,9 +2682,11 @@
           <w:bottom w:val="single" w:sz="12" w:space="1" w:color="auto"/>
         </w:pBdr>
       </w:pPr>
+      <w:proofErr w:type="spellStart"/>
       <w:r>
         <w:t>pwd</w:t>
       </w:r>
+      <w:proofErr w:type="spellEnd"/>
     </w:p>
     <w:p>
       <w:pPr>
@@ -1918,9 +2704,11 @@
           <w:bottom w:val="single" w:sz="12" w:space="1" w:color="auto"/>
         </w:pBdr>
       </w:pPr>
+      <w:proofErr w:type="spellStart"/>
       <w:r>
         <w:t>whoami</w:t>
       </w:r>
+      <w:proofErr w:type="spellEnd"/>
     </w:p>
     <w:p>
       <w:pPr>
@@ -1938,18 +2726,28 @@
           <w:bottom w:val="single" w:sz="12" w:space="1" w:color="auto"/>
         </w:pBdr>
       </w:pPr>
-      <w:r>
-        <w:t>uname -a</w:t>
-      </w:r>
-    </w:p>
-    <w:p>
-      <w:pPr>
-        <w:pBdr>
-          <w:bottom w:val="single" w:sz="12" w:space="1" w:color="auto"/>
-        </w:pBdr>
-      </w:pPr>
-      <w:r>
-        <w:t>wget http://example.com/file</w:t>
+      <w:proofErr w:type="spellStart"/>
+      <w:r>
+        <w:t>uname</w:t>
+      </w:r>
+      <w:proofErr w:type="spellEnd"/>
+      <w:r>
+        <w:t xml:space="preserve"> -a</w:t>
+      </w:r>
+    </w:p>
+    <w:p>
+      <w:pPr>
+        <w:pBdr>
+          <w:bottom w:val="single" w:sz="12" w:space="1" w:color="auto"/>
+        </w:pBdr>
+      </w:pPr>
+      <w:proofErr w:type="spellStart"/>
+      <w:r>
+        <w:t>wget</w:t>
+      </w:r>
+      <w:proofErr w:type="spellEnd"/>
+      <w:r>
+        <w:t xml:space="preserve"> http://example.com/file</w:t>
       </w:r>
     </w:p>
     <w:p>
@@ -1979,7 +2777,15 @@
         </w:pBdr>
       </w:pPr>
       <w:r>
-        <w:t xml:space="preserve">Open the Wazuh Dashboard and navigate to </w:t>
+        <w:t xml:space="preserve">Open the </w:t>
+      </w:r>
+      <w:proofErr w:type="spellStart"/>
+      <w:r>
+        <w:t>Wazuh</w:t>
+      </w:r>
+      <w:proofErr w:type="spellEnd"/>
+      <w:r>
+        <w:t xml:space="preserve"> Dashboard and navigate to </w:t>
       </w:r>
       <w:r>
         <w:rPr>
@@ -2023,11 +2829,30 @@
     <w:p/>
     <w:p>
       <w:r>
-        <w:t xml:space="preserve">Cowrie detection custom local rules edit ,this is the output in wazuh </w:t>
-      </w:r>
-    </w:p>
-    <w:p>
-      <w:r>
+        <w:t xml:space="preserve">Cowrie detection custom local rules </w:t>
+      </w:r>
+      <w:proofErr w:type="gramStart"/>
+      <w:r>
+        <w:t>edit ,this</w:t>
+      </w:r>
+      <w:proofErr w:type="gramEnd"/>
+      <w:r>
+        <w:t xml:space="preserve"> is the output in </w:t>
+      </w:r>
+      <w:proofErr w:type="spellStart"/>
+      <w:r>
+        <w:t>wazuh</w:t>
+      </w:r>
+      <w:proofErr w:type="spellEnd"/>
+      <w:r>
+        <w:t xml:space="preserve"> </w:t>
+      </w:r>
+    </w:p>
+    <w:p>
+      <w:r>
+        <w:rPr>
+          <w:noProof/>
+        </w:rPr>
         <w:lastRenderedPageBreak/>
         <w:drawing>
           <wp:inline distT="0" distB="0" distL="0" distR="0" wp14:anchorId="3209640A" wp14:editId="0C0D9CBF">
@@ -2066,7 +2891,179 @@
         </w:drawing>
       </w:r>
     </w:p>
-    <w:p/>
+    <w:p>
+      <w:pPr>
+        <w:pBdr>
+          <w:bottom w:val="single" w:sz="6" w:space="1" w:color="auto"/>
+        </w:pBdr>
+      </w:pPr>
+    </w:p>
+    <w:p>
+      <w:pPr>
+        <w:rPr>
+          <w:b/>
+          <w:bCs/>
+        </w:rPr>
+      </w:pPr>
+      <w:r>
+        <w:rPr>
+          <w:b/>
+          <w:bCs/>
+        </w:rPr>
+        <w:t>I suspect this is the real issue</w:t>
+      </w:r>
+    </w:p>
+    <w:p>
+      <w:r>
+        <w:t xml:space="preserve">If you're using the standard Cowrie setup, it's common for it to listen on </w:t>
+      </w:r>
+      <w:r>
+        <w:rPr>
+          <w:b/>
+          <w:bCs/>
+        </w:rPr>
+        <w:t>2222</w:t>
+      </w:r>
+      <w:r>
+        <w:t xml:space="preserve">, not </w:t>
+      </w:r>
+      <w:r>
+        <w:rPr>
+          <w:b/>
+          <w:bCs/>
+        </w:rPr>
+        <w:t>22</w:t>
+      </w:r>
+      <w:r>
+        <w:t>.</w:t>
+      </w:r>
+    </w:p>
+    <w:p>
+      <w:r>
+        <w:t>In that case:</w:t>
+      </w:r>
+    </w:p>
+    <w:p>
+      <w:pPr>
+        <w:numPr>
+          <w:ilvl w:val="0"/>
+          <w:numId w:val="2"/>
+        </w:numPr>
+      </w:pPr>
+      <w:r>
+        <w:t xml:space="preserve">Add a </w:t>
+      </w:r>
+      <w:proofErr w:type="spellStart"/>
+      <w:r>
+        <w:t>pfSense</w:t>
+      </w:r>
+      <w:proofErr w:type="spellEnd"/>
+      <w:r>
+        <w:t xml:space="preserve"> rule for </w:t>
+      </w:r>
+      <w:r>
+        <w:rPr>
+          <w:b/>
+          <w:bCs/>
+        </w:rPr>
+        <w:t>TCP 2222</w:t>
+      </w:r>
+      <w:r>
+        <w:t xml:space="preserve"> from REDTEAM → DMZ. </w:t>
+      </w:r>
+    </w:p>
+    <w:p>
+      <w:pPr>
+        <w:numPr>
+          <w:ilvl w:val="0"/>
+          <w:numId w:val="2"/>
+        </w:numPr>
+      </w:pPr>
+      <w:r>
+        <w:t xml:space="preserve">Connect from Kali using: </w:t>
+      </w:r>
+    </w:p>
+    <w:p>
+      <w:r>
+        <w:t>ssh -p 2222 &lt;user&gt;@192.168.70.20</w:t>
+      </w:r>
+    </w:p>
+    <w:p>
+      <w:pPr>
+        <w:rPr>
+          <w:b/>
+          <w:bCs/>
+        </w:rPr>
+      </w:pPr>
+      <w:r>
+        <w:rPr>
+          <w:b/>
+          <w:bCs/>
+        </w:rPr>
+        <w:t>Please send me:</w:t>
+      </w:r>
+    </w:p>
+    <w:p>
+      <w:pPr>
+        <w:numPr>
+          <w:ilvl w:val="0"/>
+          <w:numId w:val="3"/>
+        </w:numPr>
+      </w:pPr>
+      <w:r>
+        <w:t xml:space="preserve">Output of: </w:t>
+      </w:r>
+    </w:p>
+    <w:p>
+      <w:proofErr w:type="spellStart"/>
+      <w:r>
+        <w:t>nmap</w:t>
+      </w:r>
+      <w:proofErr w:type="spellEnd"/>
+      <w:r>
+        <w:t xml:space="preserve"> -</w:t>
+      </w:r>
+      <w:proofErr w:type="spellStart"/>
+      <w:r>
+        <w:t>Pn</w:t>
+      </w:r>
+      <w:proofErr w:type="spellEnd"/>
+      <w:r>
+        <w:t xml:space="preserve"> -p 22,2222 192.168.70.20</w:t>
+      </w:r>
+    </w:p>
+    <w:p>
+      <w:pPr>
+        <w:numPr>
+          <w:ilvl w:val="0"/>
+          <w:numId w:val="4"/>
+        </w:numPr>
+      </w:pPr>
+      <w:r>
+        <w:lastRenderedPageBreak/>
+        <w:t xml:space="preserve">Output of: </w:t>
+      </w:r>
+    </w:p>
+    <w:p>
+      <w:proofErr w:type="spellStart"/>
+      <w:r>
+        <w:t>sudo</w:t>
+      </w:r>
+      <w:proofErr w:type="spellEnd"/>
+      <w:r>
+        <w:t xml:space="preserve"> ss -</w:t>
+      </w:r>
+      <w:proofErr w:type="spellStart"/>
+      <w:r>
+        <w:t>tlnp</w:t>
+      </w:r>
+      <w:proofErr w:type="spellEnd"/>
+    </w:p>
+    <w:p>
+      <w:r>
+        <w:t>from the Cowrie VM.</w:t>
+      </w:r>
+    </w:p>
     <w:p/>
     <w:sectPr>
       <w:pgSz w:w="11906" w:h="16838"/>
@@ -2081,6 +3078,119 @@
 <file path=word/numbering.xml><?xml version="1.0" encoding="utf-8"?>
 <w:numbering xmlns:wpc="http://schemas.microsoft.com/office/word/2010/wordprocessingCanvas" xmlns:cx="http://schemas.microsoft.com/office/drawing/2014/chartex" xmlns:cx1="http://schemas.microsoft.com/office/drawing/2015/9/8/chartex" xmlns:cx2="http://schemas.microsoft.com/office/drawing/2015/10/21/chartex" xmlns:cx3="http://schemas.microsoft.com/office/drawing/2016/5/9/chartex" xmlns:cx4="http://schemas.microsoft.com/office/drawing/2016/5/10/chartex" xmlns:cx5="http://schemas.microsoft.com/office/drawing/2016/5/11/chartex" xmlns:cx6="http://schemas.microsoft.com/office/drawing/2016/5/12/chartex" xmlns:cx7="http://schemas.microsoft.com/office/drawing/2016/5/13/chartex" xmlns:cx8="http://schemas.microsoft.com/office/drawing/2016/5/14/chartex" xmlns:mc="http://schemas.openxmlformats.org/markup-compatibility/2006" xmlns:aink="http://schemas.microsoft.com/office/drawing/2016/ink" xmlns:am3d="http://schemas.microsoft.com/office/drawing/2017/model3d" xmlns:o="urn:schemas-microsoft-com:office:office" xmlns:oel="http://schemas.microsoft.com/office/2019/extlst" xmlns:r="http://schemas.openxmlformats.org/officeDocument/2006/relationships" xmlns:m="http://schemas.openxmlformats.org/officeDocument/2006/math" xmlns:v="urn:schemas-microsoft-com:vml" xmlns:wp14="http://schemas.microsoft.com/office/word/2010/wordprocessingDrawing" xmlns:wp="http://schemas.openxmlformats.org/drawingml/2006/wordprocessingDrawing" xmlns:w10="urn:schemas-microsoft-com:office:word" xmlns:w="http://schemas.openxmlformats.org/wordprocessingml/2006/main" xmlns:w14="http://schemas.microsoft.com/office/word/2010/wordml" xmlns:w15="http://schemas.microsoft.com/office/word/2012/wordml" xmlns:w16cex="http://schemas.microsoft.com/office/word/2018/wordml/cex" xmlns:w16cid="http://schemas.microsoft.com/office/word/2016/wordml/cid" xmlns:w16="http://schemas.microsoft.com/office/word/2018/wordml" xmlns:w16du="http://schemas.microsoft.com/office/word/2023/wordml/word16du" xmlns:w16sdtdh="http://schemas.microsoft.com/office/word/2020/wordml/sdtdatahash" xmlns:w16sdtfl="http://schemas.microsoft.com/office/word/2024/wordml/sdtformatlock" xmlns:w16se="http://schemas.microsoft.com/office/word/2015/wordml/symex" xmlns:wpg="http://schemas.microsoft.com/office/word/2010/wordprocessingGroup" xmlns:wpi="http://schemas.microsoft.com/office/word/2010/wordprocessingInk" xmlns:wne="http://schemas.microsoft.com/office/word/2006/wordml" xmlns:wps="http://schemas.microsoft.com/office/word/2010/wordprocessingShape" mc:Ignorable="w14 w15 w16se w16cid w16 w16cex w16sdtdh w16sdtfl w16du wp14">
   <w:abstractNum w:abstractNumId="0" w15:restartNumberingAfterBreak="0">
+    <w:nsid w:val="1DFE473B"/>
+    <w:multiLevelType w:val="multilevel"/>
+    <w:tmpl w:val="E9DAE084"/>
+    <w:lvl w:ilvl="0">
+      <w:start w:val="2"/>
+      <w:numFmt w:val="decimal"/>
+      <w:lvlText w:val="%1."/>
+      <w:lvlJc w:val="left"/>
+      <w:pPr>
+        <w:tabs>
+          <w:tab w:val="num" w:pos="720"/>
+        </w:tabs>
+        <w:ind w:left="720" w:hanging="360"/>
+      </w:pPr>
+    </w:lvl>
+    <w:lvl w:ilvl="1" w:tentative="1">
+      <w:start w:val="1"/>
+      <w:numFmt w:val="decimal"/>
+      <w:lvlText w:val="%2."/>
+      <w:lvlJc w:val="left"/>
+      <w:pPr>
+        <w:tabs>
+          <w:tab w:val="num" w:pos="1440"/>
+        </w:tabs>
+        <w:ind w:left="1440" w:hanging="360"/>
+      </w:pPr>
+    </w:lvl>
+    <w:lvl w:ilvl="2" w:tentative="1">
+      <w:start w:val="1"/>
+      <w:numFmt w:val="decimal"/>
+      <w:lvlText w:val="%3."/>
+      <w:lvlJc w:val="left"/>
+      <w:pPr>
+        <w:tabs>
+          <w:tab w:val="num" w:pos="2160"/>
+        </w:tabs>
+        <w:ind w:left="2160" w:hanging="360"/>
+      </w:pPr>
+    </w:lvl>
+    <w:lvl w:ilvl="3" w:tentative="1">
+      <w:start w:val="1"/>
+      <w:numFmt w:val="decimal"/>
+      <w:lvlText w:val="%4."/>
+      <w:lvlJc w:val="left"/>
+      <w:pPr>
+        <w:tabs>
+          <w:tab w:val="num" w:pos="2880"/>
+        </w:tabs>
+        <w:ind w:left="2880" w:hanging="360"/>
+      </w:pPr>
+    </w:lvl>
+    <w:lvl w:ilvl="4" w:tentative="1">
+      <w:start w:val="1"/>
+      <w:numFmt w:val="decimal"/>
+      <w:lvlText w:val="%5."/>
+      <w:lvlJc w:val="left"/>
+      <w:pPr>
+        <w:tabs>
+          <w:tab w:val="num" w:pos="3600"/>
+        </w:tabs>
+        <w:ind w:left="3600" w:hanging="360"/>
+      </w:pPr>
+    </w:lvl>
+    <w:lvl w:ilvl="5" w:tentative="1">
+      <w:start w:val="1"/>
+      <w:numFmt w:val="decimal"/>
+      <w:lvlText w:val="%6."/>
+      <w:lvlJc w:val="left"/>
+      <w:pPr>
+        <w:tabs>
+          <w:tab w:val="num" w:pos="4320"/>
+        </w:tabs>
+        <w:ind w:left="4320" w:hanging="360"/>
+      </w:pPr>
+    </w:lvl>
+    <w:lvl w:ilvl="6" w:tentative="1">
+      <w:start w:val="1"/>
+      <w:numFmt w:val="decimal"/>
+      <w:lvlText w:val="%7."/>
+      <w:lvlJc w:val="left"/>
+      <w:pPr>
+        <w:tabs>
+          <w:tab w:val="num" w:pos="5040"/>
+        </w:tabs>
+        <w:ind w:left="5040" w:hanging="360"/>
+      </w:pPr>
+    </w:lvl>
+    <w:lvl w:ilvl="7" w:tentative="1">
+      <w:start w:val="1"/>
+      <w:numFmt w:val="decimal"/>
+      <w:lvlText w:val="%8."/>
+      <w:lvlJc w:val="left"/>
+      <w:pPr>
+        <w:tabs>
+          <w:tab w:val="num" w:pos="5760"/>
+        </w:tabs>
+        <w:ind w:left="5760" w:hanging="360"/>
+      </w:pPr>
+    </w:lvl>
+    <w:lvl w:ilvl="8" w:tentative="1">
+      <w:start w:val="1"/>
+      <w:numFmt w:val="decimal"/>
+      <w:lvlText w:val="%9."/>
+      <w:lvlJc w:val="left"/>
+      <w:pPr>
+        <w:tabs>
+          <w:tab w:val="num" w:pos="6480"/>
+        </w:tabs>
+        <w:ind w:left="6480" w:hanging="360"/>
+      </w:pPr>
+    </w:lvl>
+  </w:abstractNum>
+  <w:abstractNum w:abstractNumId="1" w15:restartNumberingAfterBreak="0">
     <w:nsid w:val="42562C00"/>
     <w:multiLevelType w:val="multilevel"/>
     <w:tmpl w:val="69E0143A"/>
@@ -2229,7 +3339,278 @@
       </w:rPr>
     </w:lvl>
   </w:abstractNum>
+  <w:abstractNum w:abstractNumId="2" w15:restartNumberingAfterBreak="0">
+    <w:nsid w:val="476E1CEF"/>
+    <w:multiLevelType w:val="multilevel"/>
+    <w:tmpl w:val="7756A532"/>
+    <w:lvl w:ilvl="0">
+      <w:start w:val="1"/>
+      <w:numFmt w:val="bullet"/>
+      <w:lvlText w:val=""/>
+      <w:lvlJc w:val="left"/>
+      <w:pPr>
+        <w:tabs>
+          <w:tab w:val="num" w:pos="720"/>
+        </w:tabs>
+        <w:ind w:left="720" w:hanging="360"/>
+      </w:pPr>
+      <w:rPr>
+        <w:rFonts w:ascii="Symbol" w:hAnsi="Symbol" w:hint="default"/>
+        <w:sz w:val="20"/>
+      </w:rPr>
+    </w:lvl>
+    <w:lvl w:ilvl="1" w:tentative="1">
+      <w:start w:val="1"/>
+      <w:numFmt w:val="bullet"/>
+      <w:lvlText w:val="o"/>
+      <w:lvlJc w:val="left"/>
+      <w:pPr>
+        <w:tabs>
+          <w:tab w:val="num" w:pos="1440"/>
+        </w:tabs>
+        <w:ind w:left="1440" w:hanging="360"/>
+      </w:pPr>
+      <w:rPr>
+        <w:rFonts w:ascii="Courier New" w:hAnsi="Courier New" w:hint="default"/>
+        <w:sz w:val="20"/>
+      </w:rPr>
+    </w:lvl>
+    <w:lvl w:ilvl="2" w:tentative="1">
+      <w:start w:val="1"/>
+      <w:numFmt w:val="bullet"/>
+      <w:lvlText w:val=""/>
+      <w:lvlJc w:val="left"/>
+      <w:pPr>
+        <w:tabs>
+          <w:tab w:val="num" w:pos="2160"/>
+        </w:tabs>
+        <w:ind w:left="2160" w:hanging="360"/>
+      </w:pPr>
+      <w:rPr>
+        <w:rFonts w:ascii="Wingdings" w:hAnsi="Wingdings" w:hint="default"/>
+        <w:sz w:val="20"/>
+      </w:rPr>
+    </w:lvl>
+    <w:lvl w:ilvl="3" w:tentative="1">
+      <w:start w:val="1"/>
+      <w:numFmt w:val="bullet"/>
+      <w:lvlText w:val=""/>
+      <w:lvlJc w:val="left"/>
+      <w:pPr>
+        <w:tabs>
+          <w:tab w:val="num" w:pos="2880"/>
+        </w:tabs>
+        <w:ind w:left="2880" w:hanging="360"/>
+      </w:pPr>
+      <w:rPr>
+        <w:rFonts w:ascii="Wingdings" w:hAnsi="Wingdings" w:hint="default"/>
+        <w:sz w:val="20"/>
+      </w:rPr>
+    </w:lvl>
+    <w:lvl w:ilvl="4" w:tentative="1">
+      <w:start w:val="1"/>
+      <w:numFmt w:val="bullet"/>
+      <w:lvlText w:val=""/>
+      <w:lvlJc w:val="left"/>
+      <w:pPr>
+        <w:tabs>
+          <w:tab w:val="num" w:pos="3600"/>
+        </w:tabs>
+        <w:ind w:left="3600" w:hanging="360"/>
+      </w:pPr>
+      <w:rPr>
+        <w:rFonts w:ascii="Wingdings" w:hAnsi="Wingdings" w:hint="default"/>
+        <w:sz w:val="20"/>
+      </w:rPr>
+    </w:lvl>
+    <w:lvl w:ilvl="5" w:tentative="1">
+      <w:start w:val="1"/>
+      <w:numFmt w:val="bullet"/>
+      <w:lvlText w:val=""/>
+      <w:lvlJc w:val="left"/>
+      <w:pPr>
+        <w:tabs>
+          <w:tab w:val="num" w:pos="4320"/>
+        </w:tabs>
+        <w:ind w:left="4320" w:hanging="360"/>
+      </w:pPr>
+      <w:rPr>
+        <w:rFonts w:ascii="Wingdings" w:hAnsi="Wingdings" w:hint="default"/>
+        <w:sz w:val="20"/>
+      </w:rPr>
+    </w:lvl>
+    <w:lvl w:ilvl="6" w:tentative="1">
+      <w:start w:val="1"/>
+      <w:numFmt w:val="bullet"/>
+      <w:lvlText w:val=""/>
+      <w:lvlJc w:val="left"/>
+      <w:pPr>
+        <w:tabs>
+          <w:tab w:val="num" w:pos="5040"/>
+        </w:tabs>
+        <w:ind w:left="5040" w:hanging="360"/>
+      </w:pPr>
+      <w:rPr>
+        <w:rFonts w:ascii="Wingdings" w:hAnsi="Wingdings" w:hint="default"/>
+        <w:sz w:val="20"/>
+      </w:rPr>
+    </w:lvl>
+    <w:lvl w:ilvl="7" w:tentative="1">
+      <w:start w:val="1"/>
+      <w:numFmt w:val="bullet"/>
+      <w:lvlText w:val=""/>
+      <w:lvlJc w:val="left"/>
+      <w:pPr>
+        <w:tabs>
+          <w:tab w:val="num" w:pos="5760"/>
+        </w:tabs>
+        <w:ind w:left="5760" w:hanging="360"/>
+      </w:pPr>
+      <w:rPr>
+        <w:rFonts w:ascii="Wingdings" w:hAnsi="Wingdings" w:hint="default"/>
+        <w:sz w:val="20"/>
+      </w:rPr>
+    </w:lvl>
+    <w:lvl w:ilvl="8" w:tentative="1">
+      <w:start w:val="1"/>
+      <w:numFmt w:val="bullet"/>
+      <w:lvlText w:val=""/>
+      <w:lvlJc w:val="left"/>
+      <w:pPr>
+        <w:tabs>
+          <w:tab w:val="num" w:pos="6480"/>
+        </w:tabs>
+        <w:ind w:left="6480" w:hanging="360"/>
+      </w:pPr>
+      <w:rPr>
+        <w:rFonts w:ascii="Wingdings" w:hAnsi="Wingdings" w:hint="default"/>
+        <w:sz w:val="20"/>
+      </w:rPr>
+    </w:lvl>
+  </w:abstractNum>
+  <w:abstractNum w:abstractNumId="3" w15:restartNumberingAfterBreak="0">
+    <w:nsid w:val="517824F1"/>
+    <w:multiLevelType w:val="multilevel"/>
+    <w:tmpl w:val="F7565988"/>
+    <w:lvl w:ilvl="0">
+      <w:start w:val="1"/>
+      <w:numFmt w:val="decimal"/>
+      <w:lvlText w:val="%1."/>
+      <w:lvlJc w:val="left"/>
+      <w:pPr>
+        <w:tabs>
+          <w:tab w:val="num" w:pos="720"/>
+        </w:tabs>
+        <w:ind w:left="720" w:hanging="360"/>
+      </w:pPr>
+    </w:lvl>
+    <w:lvl w:ilvl="1" w:tentative="1">
+      <w:start w:val="1"/>
+      <w:numFmt w:val="decimal"/>
+      <w:lvlText w:val="%2."/>
+      <w:lvlJc w:val="left"/>
+      <w:pPr>
+        <w:tabs>
+          <w:tab w:val="num" w:pos="1440"/>
+        </w:tabs>
+        <w:ind w:left="1440" w:hanging="360"/>
+      </w:pPr>
+    </w:lvl>
+    <w:lvl w:ilvl="2" w:tentative="1">
+      <w:start w:val="1"/>
+      <w:numFmt w:val="decimal"/>
+      <w:lvlText w:val="%3."/>
+      <w:lvlJc w:val="left"/>
+      <w:pPr>
+        <w:tabs>
+          <w:tab w:val="num" w:pos="2160"/>
+        </w:tabs>
+        <w:ind w:left="2160" w:hanging="360"/>
+      </w:pPr>
+    </w:lvl>
+    <w:lvl w:ilvl="3" w:tentative="1">
+      <w:start w:val="1"/>
+      <w:numFmt w:val="decimal"/>
+      <w:lvlText w:val="%4."/>
+      <w:lvlJc w:val="left"/>
+      <w:pPr>
+        <w:tabs>
+          <w:tab w:val="num" w:pos="2880"/>
+        </w:tabs>
+        <w:ind w:left="2880" w:hanging="360"/>
+      </w:pPr>
+    </w:lvl>
+    <w:lvl w:ilvl="4" w:tentative="1">
+      <w:start w:val="1"/>
+      <w:numFmt w:val="decimal"/>
+      <w:lvlText w:val="%5."/>
+      <w:lvlJc w:val="left"/>
+      <w:pPr>
+        <w:tabs>
+          <w:tab w:val="num" w:pos="3600"/>
+        </w:tabs>
+        <w:ind w:left="3600" w:hanging="360"/>
+      </w:pPr>
+    </w:lvl>
+    <w:lvl w:ilvl="5" w:tentative="1">
+      <w:start w:val="1"/>
+      <w:numFmt w:val="decimal"/>
+      <w:lvlText w:val="%6."/>
+      <w:lvlJc w:val="left"/>
+      <w:pPr>
+        <w:tabs>
+          <w:tab w:val="num" w:pos="4320"/>
+        </w:tabs>
+        <w:ind w:left="4320" w:hanging="360"/>
+      </w:pPr>
+    </w:lvl>
+    <w:lvl w:ilvl="6" w:tentative="1">
+      <w:start w:val="1"/>
+      <w:numFmt w:val="decimal"/>
+      <w:lvlText w:val="%7."/>
+      <w:lvlJc w:val="left"/>
+      <w:pPr>
+        <w:tabs>
+          <w:tab w:val="num" w:pos="5040"/>
+        </w:tabs>
+        <w:ind w:left="5040" w:hanging="360"/>
+      </w:pPr>
+    </w:lvl>
+    <w:lvl w:ilvl="7" w:tentative="1">
+      <w:start w:val="1"/>
+      <w:numFmt w:val="decimal"/>
+      <w:lvlText w:val="%8."/>
+      <w:lvlJc w:val="left"/>
+      <w:pPr>
+        <w:tabs>
+          <w:tab w:val="num" w:pos="5760"/>
+        </w:tabs>
+        <w:ind w:left="5760" w:hanging="360"/>
+      </w:pPr>
+    </w:lvl>
+    <w:lvl w:ilvl="8" w:tentative="1">
+      <w:start w:val="1"/>
+      <w:numFmt w:val="decimal"/>
+      <w:lvlText w:val="%9."/>
+      <w:lvlJc w:val="left"/>
+      <w:pPr>
+        <w:tabs>
+          <w:tab w:val="num" w:pos="6480"/>
+        </w:tabs>
+        <w:ind w:left="6480" w:hanging="360"/>
+      </w:pPr>
+    </w:lvl>
+  </w:abstractNum>
   <w:num w:numId="1" w16cid:durableId="1007904502">
+    <w:abstractNumId w:val="1"/>
+  </w:num>
+  <w:num w:numId="2" w16cid:durableId="2109613870">
+    <w:abstractNumId w:val="2"/>
+  </w:num>
+  <w:num w:numId="3" w16cid:durableId="382948514">
+    <w:abstractNumId w:val="3"/>
+  </w:num>
+  <w:num w:numId="4" w16cid:durableId="1774671727">
     <w:abstractNumId w:val="0"/>
   </w:num>
 </w:numbering>

</xml_diff>